<commit_message>
Fix ecg editor and batch config issues; update pspm_convert_hb2hp and add tests
</commit_message>
<xml_diff>
--- a/doc/Tests_Current_Status.docx
+++ b/doc/Tests_Current_Status.docx
@@ -1,6 +1,6 @@
 
 <file path=word/document.xml><?xml version="1.0" encoding="utf-8"?>
-<w:document xmlns:o="urn:schemas-microsoft-com:office:office" xmlns:r="http://schemas.openxmlformats.org/officeDocument/2006/relationships" xmlns:v="urn:schemas-microsoft-com:vml" xmlns:w="http://schemas.openxmlformats.org/wordprocessingml/2006/main" xmlns:w10="urn:schemas-microsoft-com:office:word" xmlns:wp="http://schemas.openxmlformats.org/drawingml/2006/wordprocessingDrawing" xmlns:wps="http://schemas.microsoft.com/office/word/2010/wordprocessingShape" xmlns:wpg="http://schemas.microsoft.com/office/word/2010/wordprocessingGroup" xmlns:mc="http://schemas.openxmlformats.org/markup-compatibility/2006" xmlns:wp14="http://schemas.microsoft.com/office/word/2010/wordprocessingDrawing" xmlns:w14="http://schemas.microsoft.com/office/word/2010/wordml" mc:Ignorable="w14 wp14">
+<w:document xmlns:o="urn:schemas-microsoft-com:office:office" xmlns:r="http://schemas.openxmlformats.org/officeDocument/2006/relationships" xmlns:v="urn:schemas-microsoft-com:vml" xmlns:w="http://schemas.openxmlformats.org/wordprocessingml/2006/main" xmlns:w10="urn:schemas-microsoft-com:office:word" xmlns:wp="http://schemas.openxmlformats.org/drawingml/2006/wordprocessingDrawing" xmlns:pic="http://schemas.openxmlformats.org/drawingml/2006/picture" xmlns:wps="http://schemas.microsoft.com/office/word/2010/wordprocessingShape" xmlns:wpg="http://schemas.microsoft.com/office/word/2010/wordprocessingGroup" xmlns:mc="http://schemas.openxmlformats.org/markup-compatibility/2006" xmlns:wp14="http://schemas.microsoft.com/office/word/2010/wordprocessingDrawing" xmlns:w14="http://schemas.microsoft.com/office/word/2010/wordml" xmlns:w15="http://schemas.microsoft.com/office/word/2012/wordml" mc:Ignorable="w14 wp14 w15">
   <w:body>
     <w:p>
       <w:pPr>
@@ -20,7 +20,6 @@
       <w:pPr>
         <w:pStyle w:val="Normal"/>
         <w:rPr>
-          <w:b/>
           <w:b/>
           <w:lang w:val="en-GB"/>
         </w:rPr>
@@ -151,24 +150,25 @@
         <w:tblW w:w="9243" w:type="dxa"/>
         <w:jc w:val="left"/>
         <w:tblInd w:w="0" w:type="dxa"/>
+        <w:tblLayout w:type="fixed"/>
         <w:tblCellMar>
           <w:top w:w="0" w:type="dxa"/>
           <w:left w:w="108" w:type="dxa"/>
           <w:bottom w:w="0" w:type="dxa"/>
           <w:right w:w="108" w:type="dxa"/>
         </w:tblCellMar>
-        <w:tblLook w:noVBand="1" w:val="04a0" w:noHBand="0" w:lastColumn="0" w:firstColumn="1" w:lastRow="0" w:firstRow="1"/>
+        <w:tblLook w:val="04a0" w:noHBand="0" w:noVBand="1" w:firstColumn="1" w:lastRow="0" w:lastColumn="0" w:firstRow="1"/>
       </w:tblPr>
       <w:tblGrid>
-        <w:gridCol w:w="3506"/>
+        <w:gridCol w:w="3505"/>
         <w:gridCol w:w="3969"/>
-        <w:gridCol w:w="1768"/>
+        <w:gridCol w:w="1769"/>
       </w:tblGrid>
       <w:tr>
         <w:trPr/>
         <w:tc>
           <w:tcPr>
-            <w:tcW w:w="3506" w:type="dxa"/>
+            <w:tcW w:w="3505" w:type="dxa"/>
             <w:tcBorders/>
             <w:shd w:fill="auto" w:val="clear"/>
           </w:tcPr>
@@ -211,7 +211,7 @@
         </w:tc>
         <w:tc>
           <w:tcPr>
-            <w:tcW w:w="1768" w:type="dxa"/>
+            <w:tcW w:w="1769" w:type="dxa"/>
             <w:tcBorders/>
             <w:shd w:fill="auto" w:val="clear"/>
           </w:tcPr>
@@ -291,51 +291,51 @@
         <w:trPr/>
         <w:tc>
           <w:tcPr>
-            <w:tcW w:w="3506" w:type="dxa"/>
-            <w:tcBorders/>
-            <w:shd w:fill="auto" w:val="clear"/>
-          </w:tcPr>
-          <w:p>
-            <w:pPr>
-              <w:pStyle w:val="Normal"/>
-              <w:spacing w:lineRule="auto" w:line="240" w:before="0" w:after="0"/>
-              <w:rPr>
-                <w:lang w:val="en-US"/>
-              </w:rPr>
-            </w:pPr>
-            <w:r>
-              <w:rPr>
-                <w:lang w:val="en-US"/>
-              </w:rPr>
-              <w:t xml:space="preserve">f_SCR.m </w:t>
-            </w:r>
-          </w:p>
-        </w:tc>
-        <w:tc>
-          <w:tcPr>
-            <w:tcW w:w="3969" w:type="dxa"/>
-            <w:tcBorders/>
-            <w:shd w:fill="auto" w:val="clear"/>
-          </w:tcPr>
-          <w:p>
-            <w:pPr>
-              <w:pStyle w:val="Normal"/>
-              <w:spacing w:lineRule="auto" w:line="240" w:before="0" w:after="0"/>
-              <w:rPr>
-                <w:lang w:val="en-US"/>
-              </w:rPr>
-            </w:pPr>
-            <w:r>
-              <w:rPr>
-                <w:lang w:val="en-US"/>
-              </w:rPr>
-              <w:t xml:space="preserve">The exists test for function calling f_SCR. E.g. pspm_bf_test. Implication that f_SCR should be correct </w:t>
-            </w:r>
-          </w:p>
-        </w:tc>
-        <w:tc>
-          <w:tcPr>
-            <w:tcW w:w="1768" w:type="dxa"/>
+            <w:tcW w:w="3505" w:type="dxa"/>
+            <w:tcBorders/>
+            <w:shd w:fill="auto" w:val="clear"/>
+          </w:tcPr>
+          <w:p>
+            <w:pPr>
+              <w:pStyle w:val="Normal"/>
+              <w:spacing w:lineRule="auto" w:line="240" w:before="0" w:after="0"/>
+              <w:rPr>
+                <w:lang w:val="en-US"/>
+              </w:rPr>
+            </w:pPr>
+            <w:r>
+              <w:rPr>
+                <w:lang w:val="en-US"/>
+              </w:rPr>
+              <w:t>f_SCR.m</w:t>
+            </w:r>
+          </w:p>
+        </w:tc>
+        <w:tc>
+          <w:tcPr>
+            <w:tcW w:w="3969" w:type="dxa"/>
+            <w:tcBorders/>
+            <w:shd w:fill="auto" w:val="clear"/>
+          </w:tcPr>
+          <w:p>
+            <w:pPr>
+              <w:pStyle w:val="Normal"/>
+              <w:spacing w:lineRule="auto" w:line="240" w:before="0" w:after="0"/>
+              <w:rPr>
+                <w:lang w:val="en-US"/>
+              </w:rPr>
+            </w:pPr>
+            <w:r>
+              <w:rPr>
+                <w:lang w:val="en-US"/>
+              </w:rPr>
+              <w:t>The exists test for function calling f_SCR. E.g. pspm_bf_test. Implication that f_SCR should be correct</w:t>
+            </w:r>
+          </w:p>
+        </w:tc>
+        <w:tc>
+          <w:tcPr>
+            <w:tcW w:w="1769" w:type="dxa"/>
             <w:tcBorders/>
             <w:shd w:color="auto" w:fill="00B050" w:val="clear"/>
           </w:tcPr>
@@ -360,7 +360,7 @@
         <w:trPr/>
         <w:tc>
           <w:tcPr>
-            <w:tcW w:w="3506" w:type="dxa"/>
+            <w:tcW w:w="3505" w:type="dxa"/>
             <w:tcBorders/>
             <w:shd w:fill="auto" w:val="clear"/>
           </w:tcPr>
@@ -403,48 +403,48 @@
         </w:tc>
         <w:tc>
           <w:tcPr>
-            <w:tcW w:w="1768" w:type="dxa"/>
-            <w:tcBorders/>
-            <w:shd w:fill="auto" w:val="clear"/>
-          </w:tcPr>
-          <w:p>
-            <w:pPr>
-              <w:pStyle w:val="Normal"/>
-              <w:spacing w:lineRule="auto" w:line="240" w:before="0" w:after="0"/>
-              <w:rPr>
-                <w:lang w:val="en-US"/>
-              </w:rPr>
-            </w:pPr>
-            <w:r>
-              <w:rPr>
-                <w:lang w:val="en-US"/>
-              </w:rPr>
-              <w:t xml:space="preserve">? </w:t>
-            </w:r>
-          </w:p>
-        </w:tc>
-      </w:tr>
-      <w:tr>
-        <w:trPr/>
-        <w:tc>
-          <w:tcPr>
-            <w:tcW w:w="3506" w:type="dxa"/>
-            <w:tcBorders/>
-            <w:shd w:fill="auto" w:val="clear"/>
-          </w:tcPr>
-          <w:p>
-            <w:pPr>
-              <w:pStyle w:val="Normal"/>
-              <w:spacing w:lineRule="auto" w:line="240" w:before="0" w:after="0"/>
-              <w:rPr>
-                <w:lang w:val="en-US"/>
-              </w:rPr>
-            </w:pPr>
-            <w:r>
-              <w:rPr>
-                <w:lang w:val="en-US"/>
-              </w:rPr>
-              <w:t xml:space="preserve">g_SCR.m                      </w:t>
+            <w:tcW w:w="1769" w:type="dxa"/>
+            <w:tcBorders/>
+            <w:shd w:fill="auto" w:val="clear"/>
+          </w:tcPr>
+          <w:p>
+            <w:pPr>
+              <w:pStyle w:val="Normal"/>
+              <w:spacing w:lineRule="auto" w:line="240" w:before="0" w:after="0"/>
+              <w:rPr>
+                <w:lang w:val="en-US"/>
+              </w:rPr>
+            </w:pPr>
+            <w:r>
+              <w:rPr>
+                <w:lang w:val="en-US"/>
+              </w:rPr>
+              <w:t>?</w:t>
+            </w:r>
+          </w:p>
+        </w:tc>
+      </w:tr>
+      <w:tr>
+        <w:trPr/>
+        <w:tc>
+          <w:tcPr>
+            <w:tcW w:w="3505" w:type="dxa"/>
+            <w:tcBorders/>
+            <w:shd w:fill="auto" w:val="clear"/>
+          </w:tcPr>
+          <w:p>
+            <w:pPr>
+              <w:pStyle w:val="Normal"/>
+              <w:spacing w:lineRule="auto" w:line="240" w:before="0" w:after="0"/>
+              <w:rPr>
+                <w:lang w:val="en-US"/>
+              </w:rPr>
+            </w:pPr>
+            <w:r>
+              <w:rPr>
+                <w:lang w:val="en-US"/>
+              </w:rPr>
+              <w:t>g_SCR.m</w:t>
             </w:r>
           </w:p>
         </w:tc>
@@ -472,7 +472,7 @@
         </w:tc>
         <w:tc>
           <w:tcPr>
-            <w:tcW w:w="1768" w:type="dxa"/>
+            <w:tcW w:w="1769" w:type="dxa"/>
             <w:tcBorders/>
             <w:shd w:color="auto" w:fill="00B050" w:val="clear"/>
           </w:tcPr>
@@ -496,23 +496,23 @@
         <w:trPr/>
         <w:tc>
           <w:tcPr>
-            <w:tcW w:w="3506" w:type="dxa"/>
-            <w:tcBorders/>
-            <w:shd w:fill="auto" w:val="clear"/>
-          </w:tcPr>
-          <w:p>
-            <w:pPr>
-              <w:pStyle w:val="Normal"/>
-              <w:spacing w:lineRule="auto" w:line="240" w:before="0" w:after="0"/>
-              <w:rPr>
-                <w:lang w:val="en-US"/>
-              </w:rPr>
-            </w:pPr>
-            <w:r>
-              <w:rPr>
-                <w:lang w:val="en-US"/>
-              </w:rPr>
-              <w:t xml:space="preserve">pspm_align_channels.m         </w:t>
+            <w:tcW w:w="3505" w:type="dxa"/>
+            <w:tcBorders/>
+            <w:shd w:fill="auto" w:val="clear"/>
+          </w:tcPr>
+          <w:p>
+            <w:pPr>
+              <w:pStyle w:val="Normal"/>
+              <w:spacing w:lineRule="auto" w:line="240" w:before="0" w:after="0"/>
+              <w:rPr>
+                <w:lang w:val="en-US"/>
+              </w:rPr>
+            </w:pPr>
+            <w:r>
+              <w:rPr>
+                <w:lang w:val="en-US"/>
+              </w:rPr>
+              <w:t>pspm_align_channels.m</w:t>
             </w:r>
           </w:p>
         </w:tc>
@@ -543,7 +543,7 @@
         </w:tc>
         <w:tc>
           <w:tcPr>
-            <w:tcW w:w="1768" w:type="dxa"/>
+            <w:tcW w:w="1769" w:type="dxa"/>
             <w:tcBorders/>
             <w:shd w:color="auto" w:fill="FF0000" w:val="clear"/>
           </w:tcPr>
@@ -574,51 +574,51 @@
         <w:trPr/>
         <w:tc>
           <w:tcPr>
-            <w:tcW w:w="3506" w:type="dxa"/>
-            <w:tcBorders/>
-            <w:shd w:fill="auto" w:val="clear"/>
-          </w:tcPr>
-          <w:p>
-            <w:pPr>
-              <w:pStyle w:val="Normal"/>
-              <w:spacing w:lineRule="auto" w:line="240" w:before="0" w:after="0"/>
-              <w:rPr>
-                <w:lang w:val="en-US"/>
-              </w:rPr>
-            </w:pPr>
-            <w:r>
-              <w:rPr>
-                <w:lang w:val="en-US"/>
-              </w:rPr>
-              <w:t xml:space="preserve">pspm_bf_hprf_f.m              </w:t>
-            </w:r>
-          </w:p>
-        </w:tc>
-        <w:tc>
-          <w:tcPr>
-            <w:tcW w:w="3969" w:type="dxa"/>
-            <w:tcBorders/>
-            <w:shd w:fill="auto" w:val="clear"/>
-          </w:tcPr>
-          <w:p>
-            <w:pPr>
-              <w:pStyle w:val="Normal"/>
-              <w:spacing w:lineRule="auto" w:line="240" w:before="0" w:after="0"/>
-              <w:rPr>
-                <w:lang w:val="en-US"/>
-              </w:rPr>
-            </w:pPr>
-            <w:r>
-              <w:rPr>
-                <w:lang w:val="en-US"/>
-              </w:rPr>
-              <w:t xml:space="preserve">Add test case to pspm_bf_test.m </w:t>
-            </w:r>
-          </w:p>
-        </w:tc>
-        <w:tc>
-          <w:tcPr>
-            <w:tcW w:w="1768" w:type="dxa"/>
+            <w:tcW w:w="3505" w:type="dxa"/>
+            <w:tcBorders/>
+            <w:shd w:fill="auto" w:val="clear"/>
+          </w:tcPr>
+          <w:p>
+            <w:pPr>
+              <w:pStyle w:val="Normal"/>
+              <w:spacing w:lineRule="auto" w:line="240" w:before="0" w:after="0"/>
+              <w:rPr>
+                <w:lang w:val="en-US"/>
+              </w:rPr>
+            </w:pPr>
+            <w:r>
+              <w:rPr>
+                <w:lang w:val="en-US"/>
+              </w:rPr>
+              <w:t>pspm_bf_hprf_f.m</w:t>
+            </w:r>
+          </w:p>
+        </w:tc>
+        <w:tc>
+          <w:tcPr>
+            <w:tcW w:w="3969" w:type="dxa"/>
+            <w:tcBorders/>
+            <w:shd w:fill="auto" w:val="clear"/>
+          </w:tcPr>
+          <w:p>
+            <w:pPr>
+              <w:pStyle w:val="Normal"/>
+              <w:spacing w:lineRule="auto" w:line="240" w:before="0" w:after="0"/>
+              <w:rPr>
+                <w:lang w:val="en-US"/>
+              </w:rPr>
+            </w:pPr>
+            <w:r>
+              <w:rPr>
+                <w:lang w:val="en-US"/>
+              </w:rPr>
+              <w:t>Add test case to pspm_bf_test.m</w:t>
+            </w:r>
+          </w:p>
+        </w:tc>
+        <w:tc>
+          <w:tcPr>
+            <w:tcW w:w="1769" w:type="dxa"/>
             <w:tcBorders/>
             <w:shd w:color="auto" w:fill="FFFF00" w:val="clear"/>
           </w:tcPr>
@@ -642,7 +642,7 @@
         <w:trPr/>
         <w:tc>
           <w:tcPr>
-            <w:tcW w:w="3506" w:type="dxa"/>
+            <w:tcW w:w="3505" w:type="dxa"/>
             <w:tcBorders/>
             <w:shd w:fill="auto" w:val="clear"/>
           </w:tcPr>
@@ -654,35 +654,35 @@
             </w:pPr>
             <w:r>
               <w:rPr/>
-              <w:t xml:space="preserve">pspm_bf_psrf_erl.m            </w:t>
-            </w:r>
-          </w:p>
-        </w:tc>
-        <w:tc>
-          <w:tcPr>
-            <w:tcW w:w="3969" w:type="dxa"/>
-            <w:tcBorders/>
-            <w:shd w:fill="auto" w:val="clear"/>
-          </w:tcPr>
-          <w:p>
-            <w:pPr>
-              <w:pStyle w:val="Normal"/>
-              <w:spacing w:lineRule="auto" w:line="240" w:before="0" w:after="0"/>
-              <w:rPr>
-                <w:lang w:val="en-US"/>
-              </w:rPr>
-            </w:pPr>
-            <w:r>
-              <w:rPr>
-                <w:lang w:val="en-US"/>
-              </w:rPr>
-              <w:t xml:space="preserve">Add test case to pspm_bf_test.m </w:t>
-            </w:r>
-          </w:p>
-        </w:tc>
-        <w:tc>
-          <w:tcPr>
-            <w:tcW w:w="1768" w:type="dxa"/>
+              <w:t>pspm_bf_psrf_erl.m</w:t>
+            </w:r>
+          </w:p>
+        </w:tc>
+        <w:tc>
+          <w:tcPr>
+            <w:tcW w:w="3969" w:type="dxa"/>
+            <w:tcBorders/>
+            <w:shd w:fill="auto" w:val="clear"/>
+          </w:tcPr>
+          <w:p>
+            <w:pPr>
+              <w:pStyle w:val="Normal"/>
+              <w:spacing w:lineRule="auto" w:line="240" w:before="0" w:after="0"/>
+              <w:rPr>
+                <w:lang w:val="en-US"/>
+              </w:rPr>
+            </w:pPr>
+            <w:r>
+              <w:rPr>
+                <w:lang w:val="en-US"/>
+              </w:rPr>
+              <w:t>Add test case to pspm_bf_test.m</w:t>
+            </w:r>
+          </w:p>
+        </w:tc>
+        <w:tc>
+          <w:tcPr>
+            <w:tcW w:w="1769" w:type="dxa"/>
             <w:tcBorders/>
             <w:shd w:color="auto" w:fill="FFFF00" w:val="clear"/>
           </w:tcPr>
@@ -706,51 +706,51 @@
         <w:trPr/>
         <w:tc>
           <w:tcPr>
-            <w:tcW w:w="3506" w:type="dxa"/>
-            <w:tcBorders/>
-            <w:shd w:fill="auto" w:val="clear"/>
-          </w:tcPr>
-          <w:p>
-            <w:pPr>
-              <w:pStyle w:val="Normal"/>
-              <w:spacing w:lineRule="auto" w:line="240" w:before="0" w:after="0"/>
-              <w:rPr>
-                <w:lang w:val="en-US"/>
-              </w:rPr>
-            </w:pPr>
-            <w:r>
-              <w:rPr>
-                <w:lang w:val="en-US"/>
-              </w:rPr>
-              <w:t xml:space="preserve">pspm_bf_spsrf_box.m           </w:t>
-            </w:r>
-          </w:p>
-        </w:tc>
-        <w:tc>
-          <w:tcPr>
-            <w:tcW w:w="3969" w:type="dxa"/>
-            <w:tcBorders/>
-            <w:shd w:fill="auto" w:val="clear"/>
-          </w:tcPr>
-          <w:p>
-            <w:pPr>
-              <w:pStyle w:val="Normal"/>
-              <w:spacing w:lineRule="auto" w:line="240" w:before="0" w:after="0"/>
-              <w:rPr>
-                <w:lang w:val="en-US"/>
-              </w:rPr>
-            </w:pPr>
-            <w:r>
-              <w:rPr>
-                <w:lang w:val="en-US"/>
-              </w:rPr>
-              <w:t xml:space="preserve">Add test case to pspm_bf_test.m </w:t>
-            </w:r>
-          </w:p>
-        </w:tc>
-        <w:tc>
-          <w:tcPr>
-            <w:tcW w:w="1768" w:type="dxa"/>
+            <w:tcW w:w="3505" w:type="dxa"/>
+            <w:tcBorders/>
+            <w:shd w:fill="auto" w:val="clear"/>
+          </w:tcPr>
+          <w:p>
+            <w:pPr>
+              <w:pStyle w:val="Normal"/>
+              <w:spacing w:lineRule="auto" w:line="240" w:before="0" w:after="0"/>
+              <w:rPr>
+                <w:lang w:val="en-US"/>
+              </w:rPr>
+            </w:pPr>
+            <w:r>
+              <w:rPr>
+                <w:lang w:val="en-US"/>
+              </w:rPr>
+              <w:t>pspm_bf_spsrf_box.m</w:t>
+            </w:r>
+          </w:p>
+        </w:tc>
+        <w:tc>
+          <w:tcPr>
+            <w:tcW w:w="3969" w:type="dxa"/>
+            <w:tcBorders/>
+            <w:shd w:fill="auto" w:val="clear"/>
+          </w:tcPr>
+          <w:p>
+            <w:pPr>
+              <w:pStyle w:val="Normal"/>
+              <w:spacing w:lineRule="auto" w:line="240" w:before="0" w:after="0"/>
+              <w:rPr>
+                <w:lang w:val="en-US"/>
+              </w:rPr>
+            </w:pPr>
+            <w:r>
+              <w:rPr>
+                <w:lang w:val="en-US"/>
+              </w:rPr>
+              <w:t>Add test case to pspm_bf_test.m</w:t>
+            </w:r>
+          </w:p>
+        </w:tc>
+        <w:tc>
+          <w:tcPr>
+            <w:tcW w:w="1769" w:type="dxa"/>
             <w:tcBorders/>
             <w:shd w:color="auto" w:fill="FFFF00" w:val="clear"/>
           </w:tcPr>
@@ -774,51 +774,51 @@
         <w:trPr/>
         <w:tc>
           <w:tcPr>
-            <w:tcW w:w="3506" w:type="dxa"/>
-            <w:tcBorders/>
-            <w:shd w:fill="auto" w:val="clear"/>
-          </w:tcPr>
-          <w:p>
-            <w:pPr>
-              <w:pStyle w:val="Normal"/>
-              <w:spacing w:lineRule="auto" w:line="240" w:before="0" w:after="0"/>
-              <w:rPr>
-                <w:lang w:val="en-US"/>
-              </w:rPr>
-            </w:pPr>
-            <w:r>
-              <w:rPr>
-                <w:lang w:val="en-US"/>
-              </w:rPr>
-              <w:t xml:space="preserve">pspm_bf_spsrf_gamma.m         </w:t>
-            </w:r>
-          </w:p>
-        </w:tc>
-        <w:tc>
-          <w:tcPr>
-            <w:tcW w:w="3969" w:type="dxa"/>
-            <w:tcBorders/>
-            <w:shd w:fill="auto" w:val="clear"/>
-          </w:tcPr>
-          <w:p>
-            <w:pPr>
-              <w:pStyle w:val="Normal"/>
-              <w:spacing w:lineRule="auto" w:line="240" w:before="0" w:after="0"/>
-              <w:rPr>
-                <w:lang w:val="en-US"/>
-              </w:rPr>
-            </w:pPr>
-            <w:r>
-              <w:rPr>
-                <w:lang w:val="en-US"/>
-              </w:rPr>
-              <w:t xml:space="preserve">Add test case to pspm_bf_test.m </w:t>
-            </w:r>
-          </w:p>
-        </w:tc>
-        <w:tc>
-          <w:tcPr>
-            <w:tcW w:w="1768" w:type="dxa"/>
+            <w:tcW w:w="3505" w:type="dxa"/>
+            <w:tcBorders/>
+            <w:shd w:fill="auto" w:val="clear"/>
+          </w:tcPr>
+          <w:p>
+            <w:pPr>
+              <w:pStyle w:val="Normal"/>
+              <w:spacing w:lineRule="auto" w:line="240" w:before="0" w:after="0"/>
+              <w:rPr>
+                <w:lang w:val="en-US"/>
+              </w:rPr>
+            </w:pPr>
+            <w:r>
+              <w:rPr>
+                <w:lang w:val="en-US"/>
+              </w:rPr>
+              <w:t>pspm_bf_spsrf_gamma.m</w:t>
+            </w:r>
+          </w:p>
+        </w:tc>
+        <w:tc>
+          <w:tcPr>
+            <w:tcW w:w="3969" w:type="dxa"/>
+            <w:tcBorders/>
+            <w:shd w:fill="auto" w:val="clear"/>
+          </w:tcPr>
+          <w:p>
+            <w:pPr>
+              <w:pStyle w:val="Normal"/>
+              <w:spacing w:lineRule="auto" w:line="240" w:before="0" w:after="0"/>
+              <w:rPr>
+                <w:lang w:val="en-US"/>
+              </w:rPr>
+            </w:pPr>
+            <w:r>
+              <w:rPr>
+                <w:lang w:val="en-US"/>
+              </w:rPr>
+              <w:t>Add test case to pspm_bf_test.m</w:t>
+            </w:r>
+          </w:p>
+        </w:tc>
+        <w:tc>
+          <w:tcPr>
+            <w:tcW w:w="1769" w:type="dxa"/>
             <w:tcBorders/>
             <w:shd w:color="auto" w:fill="FFFF00" w:val="clear"/>
           </w:tcPr>
@@ -842,23 +842,23 @@
         <w:trPr/>
         <w:tc>
           <w:tcPr>
-            <w:tcW w:w="3506" w:type="dxa"/>
-            <w:tcBorders/>
-            <w:shd w:fill="auto" w:val="clear"/>
-          </w:tcPr>
-          <w:p>
-            <w:pPr>
-              <w:pStyle w:val="Normal"/>
-              <w:spacing w:lineRule="auto" w:line="240" w:before="0" w:after="0"/>
-              <w:rPr>
-                <w:lang w:val="en-US"/>
-              </w:rPr>
-            </w:pPr>
-            <w:r>
-              <w:rPr>
-                <w:lang w:val="en-US"/>
-              </w:rPr>
-              <w:t xml:space="preserve">pspm_butter.m                 </w:t>
+            <w:tcW w:w="3505" w:type="dxa"/>
+            <w:tcBorders/>
+            <w:shd w:fill="auto" w:val="clear"/>
+          </w:tcPr>
+          <w:p>
+            <w:pPr>
+              <w:pStyle w:val="Normal"/>
+              <w:spacing w:lineRule="auto" w:line="240" w:before="0" w:after="0"/>
+              <w:rPr>
+                <w:lang w:val="en-US"/>
+              </w:rPr>
+            </w:pPr>
+            <w:r>
+              <w:rPr>
+                <w:lang w:val="en-US"/>
+              </w:rPr>
+              <w:t>pspm_butter.m</w:t>
             </w:r>
           </w:p>
         </w:tc>
@@ -889,7 +889,7 @@
         </w:tc>
         <w:tc>
           <w:tcPr>
-            <w:tcW w:w="1768" w:type="dxa"/>
+            <w:tcW w:w="1769" w:type="dxa"/>
             <w:tcBorders/>
             <w:shd w:color="auto" w:fill="FF0000" w:val="clear"/>
           </w:tcPr>
@@ -919,23 +919,23 @@
         <w:trPr/>
         <w:tc>
           <w:tcPr>
-            <w:tcW w:w="3506" w:type="dxa"/>
-            <w:tcBorders/>
-            <w:shd w:fill="auto" w:val="clear"/>
-          </w:tcPr>
-          <w:p>
-            <w:pPr>
-              <w:pStyle w:val="Normal"/>
-              <w:spacing w:lineRule="auto" w:line="240" w:before="0" w:after="0"/>
-              <w:rPr>
-                <w:lang w:val="en-US"/>
-              </w:rPr>
-            </w:pPr>
-            <w:r>
-              <w:rPr>
-                <w:lang w:val="en-US"/>
-              </w:rPr>
-              <w:t xml:space="preserve">pspm_check_options.m          </w:t>
+            <w:tcW w:w="3505" w:type="dxa"/>
+            <w:tcBorders/>
+            <w:shd w:fill="auto" w:val="clear"/>
+          </w:tcPr>
+          <w:p>
+            <w:pPr>
+              <w:pStyle w:val="Normal"/>
+              <w:spacing w:lineRule="auto" w:line="240" w:before="0" w:after="0"/>
+              <w:rPr>
+                <w:lang w:val="en-US"/>
+              </w:rPr>
+            </w:pPr>
+            <w:r>
+              <w:rPr>
+                <w:lang w:val="en-US"/>
+              </w:rPr>
+              <w:t>pspm_check_options.m</w:t>
             </w:r>
           </w:p>
         </w:tc>
@@ -968,7 +968,7 @@
         </w:tc>
         <w:tc>
           <w:tcPr>
-            <w:tcW w:w="1768" w:type="dxa"/>
+            <w:tcW w:w="1769" w:type="dxa"/>
             <w:tcBorders/>
             <w:shd w:color="auto" w:fill="00B050" w:val="clear"/>
           </w:tcPr>
@@ -999,23 +999,23 @@
         <w:trPr/>
         <w:tc>
           <w:tcPr>
-            <w:tcW w:w="3506" w:type="dxa"/>
-            <w:tcBorders/>
-            <w:shd w:fill="auto" w:val="clear"/>
-          </w:tcPr>
-          <w:p>
-            <w:pPr>
-              <w:pStyle w:val="Normal"/>
-              <w:spacing w:lineRule="auto" w:line="240" w:before="0" w:after="0"/>
-              <w:rPr>
-                <w:lang w:val="en-US"/>
-              </w:rPr>
-            </w:pPr>
-            <w:r>
-              <w:rPr>
-                <w:lang w:val="en-US"/>
-              </w:rPr>
-              <w:t xml:space="preserve">pspm_compute_visual_angle.m   </w:t>
+            <w:tcW w:w="3505" w:type="dxa"/>
+            <w:tcBorders/>
+            <w:shd w:fill="auto" w:val="clear"/>
+          </w:tcPr>
+          <w:p>
+            <w:pPr>
+              <w:pStyle w:val="Normal"/>
+              <w:spacing w:lineRule="auto" w:line="240" w:before="0" w:after="0"/>
+              <w:rPr>
+                <w:lang w:val="en-US"/>
+              </w:rPr>
+            </w:pPr>
+            <w:r>
+              <w:rPr>
+                <w:lang w:val="en-US"/>
+              </w:rPr>
+              <w:t>pspm_compute_visual_angle.m</w:t>
             </w:r>
           </w:p>
         </w:tc>
@@ -1044,7 +1044,7 @@
         </w:tc>
         <w:tc>
           <w:tcPr>
-            <w:tcW w:w="1768" w:type="dxa"/>
+            <w:tcW w:w="1769" w:type="dxa"/>
             <w:tcBorders/>
             <w:shd w:color="auto" w:fill="00B050" w:val="clear"/>
           </w:tcPr>
@@ -1074,23 +1074,23 @@
         <w:trPr/>
         <w:tc>
           <w:tcPr>
-            <w:tcW w:w="3506" w:type="dxa"/>
-            <w:tcBorders/>
-            <w:shd w:fill="auto" w:val="clear"/>
-          </w:tcPr>
-          <w:p>
-            <w:pPr>
-              <w:pStyle w:val="Normal"/>
-              <w:spacing w:lineRule="auto" w:line="240" w:before="0" w:after="0"/>
-              <w:rPr>
-                <w:lang w:val="en-US"/>
-              </w:rPr>
-            </w:pPr>
-            <w:r>
-              <w:rPr>
-                <w:lang w:val="en-US"/>
-              </w:rPr>
-              <w:t xml:space="preserve">pspm_con1.m                   </w:t>
+            <w:tcW w:w="3505" w:type="dxa"/>
+            <w:tcBorders/>
+            <w:shd w:fill="auto" w:val="clear"/>
+          </w:tcPr>
+          <w:p>
+            <w:pPr>
+              <w:pStyle w:val="Normal"/>
+              <w:spacing w:lineRule="auto" w:line="240" w:before="0" w:after="0"/>
+              <w:rPr>
+                <w:lang w:val="en-US"/>
+              </w:rPr>
+            </w:pPr>
+            <w:r>
+              <w:rPr>
+                <w:lang w:val="en-US"/>
+              </w:rPr>
+              <w:t>pspm_con1.m</w:t>
             </w:r>
           </w:p>
         </w:tc>
@@ -1121,7 +1121,7 @@
         </w:tc>
         <w:tc>
           <w:tcPr>
-            <w:tcW w:w="1768" w:type="dxa"/>
+            <w:tcW w:w="1769" w:type="dxa"/>
             <w:tcBorders/>
             <w:shd w:color="auto" w:fill="FFFF00" w:val="clear"/>
           </w:tcPr>
@@ -1151,23 +1151,23 @@
         <w:trPr/>
         <w:tc>
           <w:tcPr>
-            <w:tcW w:w="3506" w:type="dxa"/>
-            <w:tcBorders/>
-            <w:shd w:fill="auto" w:val="clear"/>
-          </w:tcPr>
-          <w:p>
-            <w:pPr>
-              <w:pStyle w:val="Normal"/>
-              <w:spacing w:lineRule="auto" w:line="240" w:before="0" w:after="0"/>
-              <w:rPr>
-                <w:lang w:val="en-US"/>
-              </w:rPr>
-            </w:pPr>
-            <w:r>
-              <w:rPr>
-                <w:lang w:val="en-US"/>
-              </w:rPr>
-              <w:t xml:space="preserve">pspm_con2.m                   </w:t>
+            <w:tcW w:w="3505" w:type="dxa"/>
+            <w:tcBorders/>
+            <w:shd w:fill="auto" w:val="clear"/>
+          </w:tcPr>
+          <w:p>
+            <w:pPr>
+              <w:pStyle w:val="Normal"/>
+              <w:spacing w:lineRule="auto" w:line="240" w:before="0" w:after="0"/>
+              <w:rPr>
+                <w:lang w:val="en-US"/>
+              </w:rPr>
+            </w:pPr>
+            <w:r>
+              <w:rPr>
+                <w:lang w:val="en-US"/>
+              </w:rPr>
+              <w:t>pspm_con2.m</w:t>
             </w:r>
           </w:p>
         </w:tc>
@@ -1198,7 +1198,7 @@
         </w:tc>
         <w:tc>
           <w:tcPr>
-            <w:tcW w:w="1768" w:type="dxa"/>
+            <w:tcW w:w="1769" w:type="dxa"/>
             <w:tcBorders/>
             <w:shd w:color="auto" w:fill="FFFF00" w:val="clear"/>
           </w:tcPr>
@@ -1228,23 +1228,23 @@
         <w:trPr/>
         <w:tc>
           <w:tcPr>
-            <w:tcW w:w="3506" w:type="dxa"/>
-            <w:tcBorders/>
-            <w:shd w:fill="auto" w:val="clear"/>
-          </w:tcPr>
-          <w:p>
-            <w:pPr>
-              <w:pStyle w:val="Normal"/>
-              <w:spacing w:lineRule="auto" w:line="240" w:before="0" w:after="0"/>
-              <w:rPr>
-                <w:lang w:val="en-US"/>
-              </w:rPr>
-            </w:pPr>
-            <w:r>
-              <w:rPr>
-                <w:lang w:val="en-US"/>
-              </w:rPr>
-              <w:t xml:space="preserve">pspm_contrast.m               </w:t>
+            <w:tcW w:w="3505" w:type="dxa"/>
+            <w:tcBorders/>
+            <w:shd w:fill="auto" w:val="clear"/>
+          </w:tcPr>
+          <w:p>
+            <w:pPr>
+              <w:pStyle w:val="Normal"/>
+              <w:spacing w:lineRule="auto" w:line="240" w:before="0" w:after="0"/>
+              <w:rPr>
+                <w:lang w:val="en-US"/>
+              </w:rPr>
+            </w:pPr>
+            <w:r>
+              <w:rPr>
+                <w:lang w:val="en-US"/>
+              </w:rPr>
+              <w:t>pspm_contrast.m</w:t>
             </w:r>
           </w:p>
         </w:tc>
@@ -1272,7 +1272,7 @@
         </w:tc>
         <w:tc>
           <w:tcPr>
-            <w:tcW w:w="1768" w:type="dxa"/>
+            <w:tcW w:w="1769" w:type="dxa"/>
             <w:tcBorders/>
             <w:shd w:color="auto" w:fill="FFFF00" w:val="clear"/>
           </w:tcPr>
@@ -1296,50 +1296,50 @@
         <w:trPr/>
         <w:tc>
           <w:tcPr>
-            <w:tcW w:w="3506" w:type="dxa"/>
-            <w:tcBorders/>
-            <w:shd w:fill="auto" w:val="clear"/>
-          </w:tcPr>
-          <w:p>
-            <w:pPr>
-              <w:pStyle w:val="Normal"/>
-              <w:spacing w:lineRule="auto" w:line="240" w:before="0" w:after="0"/>
-              <w:rPr>
-                <w:lang w:val="en-US"/>
-              </w:rPr>
-            </w:pPr>
-            <w:r>
-              <w:rPr>
-                <w:lang w:val="en-US"/>
-              </w:rPr>
-              <w:t xml:space="preserve">pspm_convert_area2diameter.m  </w:t>
-            </w:r>
-          </w:p>
-        </w:tc>
-        <w:tc>
-          <w:tcPr>
-            <w:tcW w:w="3969" w:type="dxa"/>
-            <w:tcBorders/>
-            <w:shd w:fill="auto" w:val="clear"/>
-          </w:tcPr>
-          <w:p>
-            <w:pPr>
-              <w:pStyle w:val="Normal"/>
-              <w:spacing w:lineRule="auto" w:line="240" w:before="0" w:after="0"/>
-              <w:rPr>
-                <w:lang w:val="en-US"/>
-              </w:rPr>
-            </w:pPr>
-            <w:r>
-              <w:rPr>
-                <w:lang w:val="en-US"/>
-              </w:rPr>
-            </w:r>
-          </w:p>
-        </w:tc>
-        <w:tc>
-          <w:tcPr>
-            <w:tcW w:w="1768" w:type="dxa"/>
+            <w:tcW w:w="3505" w:type="dxa"/>
+            <w:tcBorders/>
+            <w:shd w:fill="auto" w:val="clear"/>
+          </w:tcPr>
+          <w:p>
+            <w:pPr>
+              <w:pStyle w:val="Normal"/>
+              <w:spacing w:lineRule="auto" w:line="240" w:before="0" w:after="0"/>
+              <w:rPr>
+                <w:lang w:val="en-US"/>
+              </w:rPr>
+            </w:pPr>
+            <w:r>
+              <w:rPr>
+                <w:lang w:val="en-US"/>
+              </w:rPr>
+              <w:t>pspm_convert_area2diameter.m</w:t>
+            </w:r>
+          </w:p>
+        </w:tc>
+        <w:tc>
+          <w:tcPr>
+            <w:tcW w:w="3969" w:type="dxa"/>
+            <w:tcBorders/>
+            <w:shd w:fill="auto" w:val="clear"/>
+          </w:tcPr>
+          <w:p>
+            <w:pPr>
+              <w:pStyle w:val="Normal"/>
+              <w:spacing w:lineRule="auto" w:line="240" w:before="0" w:after="0"/>
+              <w:rPr>
+                <w:lang w:val="en-US"/>
+              </w:rPr>
+            </w:pPr>
+            <w:r>
+              <w:rPr>
+                <w:lang w:val="en-US"/>
+              </w:rPr>
+            </w:r>
+          </w:p>
+        </w:tc>
+        <w:tc>
+          <w:tcPr>
+            <w:tcW w:w="1769" w:type="dxa"/>
             <w:tcBorders/>
             <w:shd w:color="auto" w:fill="00B050" w:val="clear"/>
           </w:tcPr>
@@ -1363,23 +1363,23 @@
         <w:trPr/>
         <w:tc>
           <w:tcPr>
-            <w:tcW w:w="3506" w:type="dxa"/>
-            <w:tcBorders/>
-            <w:shd w:fill="auto" w:val="clear"/>
-          </w:tcPr>
-          <w:p>
-            <w:pPr>
-              <w:pStyle w:val="Normal"/>
-              <w:spacing w:lineRule="auto" w:line="240" w:before="0" w:after="0"/>
-              <w:rPr>
-                <w:lang w:val="en-US"/>
-              </w:rPr>
-            </w:pPr>
-            <w:r>
-              <w:rPr>
-                <w:lang w:val="en-US"/>
-              </w:rPr>
-              <w:t xml:space="preserve">pspm_convert_au2unit.m        </w:t>
+            <w:tcW w:w="3505" w:type="dxa"/>
+            <w:tcBorders/>
+            <w:shd w:fill="auto" w:val="clear"/>
+          </w:tcPr>
+          <w:p>
+            <w:pPr>
+              <w:pStyle w:val="Normal"/>
+              <w:spacing w:lineRule="auto" w:line="240" w:before="0" w:after="0"/>
+              <w:rPr>
+                <w:lang w:val="en-US"/>
+              </w:rPr>
+            </w:pPr>
+            <w:r>
+              <w:rPr>
+                <w:lang w:val="en-US"/>
+              </w:rPr>
+              <w:t>pspm_convert_au2unit.m</w:t>
             </w:r>
           </w:p>
         </w:tc>
@@ -1407,7 +1407,7 @@
         </w:tc>
         <w:tc>
           <w:tcPr>
-            <w:tcW w:w="1768" w:type="dxa"/>
+            <w:tcW w:w="1769" w:type="dxa"/>
             <w:tcBorders/>
             <w:shd w:color="auto" w:fill="FF0000" w:val="clear"/>
           </w:tcPr>
@@ -1423,31 +1423,32 @@
               <w:rPr>
                 <w:lang w:val="en-US"/>
               </w:rPr>
-            </w:r>
-          </w:p>
-        </w:tc>
-      </w:tr>
-      <w:tr>
-        <w:trPr/>
-        <w:tc>
-          <w:tcPr>
-            <w:tcW w:w="3506" w:type="dxa"/>
-            <w:tcBorders/>
-            <w:shd w:fill="auto" w:val="clear"/>
-          </w:tcPr>
-          <w:p>
-            <w:pPr>
-              <w:pStyle w:val="Normal"/>
-              <w:spacing w:lineRule="auto" w:line="240" w:before="0" w:after="0"/>
-              <w:rPr>
-                <w:lang w:val="en-US"/>
-              </w:rPr>
-            </w:pPr>
-            <w:r>
-              <w:rPr>
-                <w:lang w:val="en-US"/>
-              </w:rPr>
-              <w:t xml:space="preserve">pspm_convert_pixel2unit.m     </w:t>
+              <w:t>DONE</w:t>
+            </w:r>
+          </w:p>
+        </w:tc>
+      </w:tr>
+      <w:tr>
+        <w:trPr/>
+        <w:tc>
+          <w:tcPr>
+            <w:tcW w:w="3505" w:type="dxa"/>
+            <w:tcBorders/>
+            <w:shd w:fill="auto" w:val="clear"/>
+          </w:tcPr>
+          <w:p>
+            <w:pPr>
+              <w:pStyle w:val="Normal"/>
+              <w:spacing w:lineRule="auto" w:line="240" w:before="0" w:after="0"/>
+              <w:rPr>
+                <w:lang w:val="en-US"/>
+              </w:rPr>
+            </w:pPr>
+            <w:r>
+              <w:rPr>
+                <w:lang w:val="en-US"/>
+              </w:rPr>
+              <w:t>pspm_convert_pixel2unit.m</w:t>
             </w:r>
           </w:p>
         </w:tc>
@@ -1475,7 +1476,7 @@
         </w:tc>
         <w:tc>
           <w:tcPr>
-            <w:tcW w:w="1768" w:type="dxa"/>
+            <w:tcW w:w="1769" w:type="dxa"/>
             <w:tcBorders/>
             <w:shd w:color="auto" w:fill="FF0000" w:val="clear"/>
           </w:tcPr>
@@ -1499,23 +1500,23 @@
         <w:trPr/>
         <w:tc>
           <w:tcPr>
-            <w:tcW w:w="3506" w:type="dxa"/>
-            <w:tcBorders/>
-            <w:shd w:fill="auto" w:val="clear"/>
-          </w:tcPr>
-          <w:p>
-            <w:pPr>
-              <w:pStyle w:val="Normal"/>
-              <w:spacing w:lineRule="auto" w:line="240" w:before="0" w:after="0"/>
-              <w:rPr>
-                <w:lang w:val="en-US"/>
-              </w:rPr>
-            </w:pPr>
-            <w:r>
-              <w:rPr>
-                <w:lang w:val="en-US"/>
-              </w:rPr>
-              <w:t xml:space="preserve">pspm_convert_unit.m           </w:t>
+            <w:tcW w:w="3505" w:type="dxa"/>
+            <w:tcBorders/>
+            <w:shd w:fill="auto" w:val="clear"/>
+          </w:tcPr>
+          <w:p>
+            <w:pPr>
+              <w:pStyle w:val="Normal"/>
+              <w:spacing w:lineRule="auto" w:line="240" w:before="0" w:after="0"/>
+              <w:rPr>
+                <w:lang w:val="en-US"/>
+              </w:rPr>
+            </w:pPr>
+            <w:r>
+              <w:rPr>
+                <w:lang w:val="en-US"/>
+              </w:rPr>
+              <w:t>pspm_convert_unit.m</w:t>
             </w:r>
           </w:p>
         </w:tc>
@@ -1543,7 +1544,7 @@
         </w:tc>
         <w:tc>
           <w:tcPr>
-            <w:tcW w:w="1768" w:type="dxa"/>
+            <w:tcW w:w="1769" w:type="dxa"/>
             <w:tcBorders/>
             <w:shd w:color="auto" w:fill="FF0000" w:val="clear"/>
           </w:tcPr>
@@ -1568,23 +1569,23 @@
         <w:trPr/>
         <w:tc>
           <w:tcPr>
-            <w:tcW w:w="3506" w:type="dxa"/>
-            <w:tcBorders/>
-            <w:shd w:fill="auto" w:val="clear"/>
-          </w:tcPr>
-          <w:p>
-            <w:pPr>
-              <w:pStyle w:val="Normal"/>
-              <w:spacing w:lineRule="auto" w:line="240" w:before="0" w:after="0"/>
-              <w:rPr>
-                <w:lang w:val="en-US"/>
-              </w:rPr>
-            </w:pPr>
-            <w:r>
-              <w:rPr>
-                <w:lang w:val="en-US"/>
-              </w:rPr>
-              <w:t xml:space="preserve">pspm_convert_visangle2sps.m   </w:t>
+            <w:tcW w:w="3505" w:type="dxa"/>
+            <w:tcBorders/>
+            <w:shd w:fill="auto" w:val="clear"/>
+          </w:tcPr>
+          <w:p>
+            <w:pPr>
+              <w:pStyle w:val="Normal"/>
+              <w:spacing w:lineRule="auto" w:line="240" w:before="0" w:after="0"/>
+              <w:rPr>
+                <w:lang w:val="en-US"/>
+              </w:rPr>
+            </w:pPr>
+            <w:r>
+              <w:rPr>
+                <w:lang w:val="en-US"/>
+              </w:rPr>
+              <w:t>pspm_convert_visangle2sps.m</w:t>
             </w:r>
           </w:p>
         </w:tc>
@@ -1612,7 +1613,7 @@
         </w:tc>
         <w:tc>
           <w:tcPr>
-            <w:tcW w:w="1768" w:type="dxa"/>
+            <w:tcW w:w="1769" w:type="dxa"/>
             <w:tcBorders/>
             <w:shd w:color="auto" w:fill="00B050" w:val="clear"/>
           </w:tcPr>
@@ -1636,23 +1637,23 @@
         <w:trPr/>
         <w:tc>
           <w:tcPr>
-            <w:tcW w:w="3506" w:type="dxa"/>
-            <w:tcBorders/>
-            <w:shd w:fill="auto" w:val="clear"/>
-          </w:tcPr>
-          <w:p>
-            <w:pPr>
-              <w:pStyle w:val="Normal"/>
-              <w:spacing w:lineRule="auto" w:line="240" w:before="0" w:after="0"/>
-              <w:rPr>
-                <w:lang w:val="en-US"/>
-              </w:rPr>
-            </w:pPr>
-            <w:r>
-              <w:rPr>
-                <w:lang w:val="en-US"/>
-              </w:rPr>
-              <w:t xml:space="preserve">pspm_data_editor.m            </w:t>
+            <w:tcW w:w="3505" w:type="dxa"/>
+            <w:tcBorders/>
+            <w:shd w:fill="auto" w:val="clear"/>
+          </w:tcPr>
+          <w:p>
+            <w:pPr>
+              <w:pStyle w:val="Normal"/>
+              <w:spacing w:lineRule="auto" w:line="240" w:before="0" w:after="0"/>
+              <w:rPr>
+                <w:lang w:val="en-US"/>
+              </w:rPr>
+            </w:pPr>
+            <w:r>
+              <w:rPr>
+                <w:lang w:val="en-US"/>
+              </w:rPr>
+              <w:t>pspm_data_editor.m</w:t>
             </w:r>
           </w:p>
         </w:tc>
@@ -1687,13 +1688,13 @@
               <w:rPr>
                 <w:lang w:val="en-US"/>
               </w:rPr>
-              <w:t xml:space="preserve"> think important because of user usage </w:t>
-            </w:r>
-          </w:p>
-        </w:tc>
-        <w:tc>
-          <w:tcPr>
-            <w:tcW w:w="1768" w:type="dxa"/>
+              <w:t xml:space="preserve"> think important because of user usage</w:t>
+            </w:r>
+          </w:p>
+        </w:tc>
+        <w:tc>
+          <w:tcPr>
+            <w:tcW w:w="1769" w:type="dxa"/>
             <w:tcBorders/>
             <w:shd w:color="auto" w:fill="FF0000" w:val="clear"/>
           </w:tcPr>
@@ -1717,23 +1718,23 @@
         <w:trPr/>
         <w:tc>
           <w:tcPr>
-            <w:tcW w:w="3506" w:type="dxa"/>
-            <w:tcBorders/>
-            <w:shd w:fill="auto" w:val="clear"/>
-          </w:tcPr>
-          <w:p>
-            <w:pPr>
-              <w:pStyle w:val="Normal"/>
-              <w:spacing w:lineRule="auto" w:line="240" w:before="0" w:after="0"/>
-              <w:rPr>
-                <w:lang w:val="en-US"/>
-              </w:rPr>
-            </w:pPr>
-            <w:r>
-              <w:rPr>
-                <w:lang w:val="en-US"/>
-              </w:rPr>
-              <w:t xml:space="preserve">pspm_dcm_inv.m                </w:t>
+            <w:tcW w:w="3505" w:type="dxa"/>
+            <w:tcBorders/>
+            <w:shd w:fill="auto" w:val="clear"/>
+          </w:tcPr>
+          <w:p>
+            <w:pPr>
+              <w:pStyle w:val="Normal"/>
+              <w:spacing w:lineRule="auto" w:line="240" w:before="0" w:after="0"/>
+              <w:rPr>
+                <w:lang w:val="en-US"/>
+              </w:rPr>
+            </w:pPr>
+            <w:r>
+              <w:rPr>
+                <w:lang w:val="en-US"/>
+              </w:rPr>
+              <w:t>pspm_dcm_inv.m</w:t>
             </w:r>
           </w:p>
         </w:tc>
@@ -1761,7 +1762,7 @@
         </w:tc>
         <w:tc>
           <w:tcPr>
-            <w:tcW w:w="1768" w:type="dxa"/>
+            <w:tcW w:w="1769" w:type="dxa"/>
             <w:tcBorders/>
             <w:shd w:color="auto" w:fill="FF0000" w:val="clear"/>
           </w:tcPr>
@@ -1785,7 +1786,7 @@
         <w:trPr/>
         <w:tc>
           <w:tcPr>
-            <w:tcW w:w="3506" w:type="dxa"/>
+            <w:tcW w:w="3505" w:type="dxa"/>
             <w:tcBorders/>
             <w:shd w:fill="auto" w:val="clear"/>
           </w:tcPr>
@@ -1799,7 +1800,7 @@
               <w:rPr>
                 <w:lang w:val="en-US"/>
               </w:rPr>
-              <w:t xml:space="preserve">pspm_denoise_spike.m          </w:t>
+              <w:t>pspm_denoise_spike.m</w:t>
             </w:r>
           </w:p>
         </w:tc>
@@ -1822,7 +1823,7 @@
         </w:tc>
         <w:tc>
           <w:tcPr>
-            <w:tcW w:w="1768" w:type="dxa"/>
+            <w:tcW w:w="1769" w:type="dxa"/>
             <w:tcBorders/>
             <w:shd w:color="auto" w:fill="00B050" w:val="clear"/>
           </w:tcPr>
@@ -1842,50 +1843,50 @@
         <w:trPr/>
         <w:tc>
           <w:tcPr>
-            <w:tcW w:w="3506" w:type="dxa"/>
-            <w:tcBorders/>
-            <w:shd w:fill="auto" w:val="clear"/>
-          </w:tcPr>
-          <w:p>
-            <w:pPr>
-              <w:pStyle w:val="Normal"/>
-              <w:spacing w:lineRule="auto" w:line="240" w:before="0" w:after="0"/>
-              <w:rPr>
-                <w:lang w:val="en-US"/>
-              </w:rPr>
-            </w:pPr>
-            <w:r>
-              <w:rPr>
-                <w:lang w:val="en-US"/>
-              </w:rPr>
-              <w:t xml:space="preserve">pspm_display.m                </w:t>
-            </w:r>
-          </w:p>
-        </w:tc>
-        <w:tc>
-          <w:tcPr>
-            <w:tcW w:w="3969" w:type="dxa"/>
-            <w:tcBorders/>
-            <w:shd w:fill="auto" w:val="clear"/>
-          </w:tcPr>
-          <w:p>
-            <w:pPr>
-              <w:pStyle w:val="Normal"/>
-              <w:spacing w:lineRule="auto" w:line="240" w:before="0" w:after="0"/>
-              <w:rPr>
-                <w:lang w:val="en-US"/>
-              </w:rPr>
-            </w:pPr>
-            <w:r>
-              <w:rPr>
-                <w:lang w:val="en-US"/>
-              </w:rPr>
-            </w:r>
-          </w:p>
-        </w:tc>
-        <w:tc>
-          <w:tcPr>
-            <w:tcW w:w="1768" w:type="dxa"/>
+            <w:tcW w:w="3505" w:type="dxa"/>
+            <w:tcBorders/>
+            <w:shd w:fill="auto" w:val="clear"/>
+          </w:tcPr>
+          <w:p>
+            <w:pPr>
+              <w:pStyle w:val="Normal"/>
+              <w:spacing w:lineRule="auto" w:line="240" w:before="0" w:after="0"/>
+              <w:rPr>
+                <w:lang w:val="en-US"/>
+              </w:rPr>
+            </w:pPr>
+            <w:r>
+              <w:rPr>
+                <w:lang w:val="en-US"/>
+              </w:rPr>
+              <w:t>pspm_display.m</w:t>
+            </w:r>
+          </w:p>
+        </w:tc>
+        <w:tc>
+          <w:tcPr>
+            <w:tcW w:w="3969" w:type="dxa"/>
+            <w:tcBorders/>
+            <w:shd w:fill="auto" w:val="clear"/>
+          </w:tcPr>
+          <w:p>
+            <w:pPr>
+              <w:pStyle w:val="Normal"/>
+              <w:spacing w:lineRule="auto" w:line="240" w:before="0" w:after="0"/>
+              <w:rPr>
+                <w:lang w:val="en-US"/>
+              </w:rPr>
+            </w:pPr>
+            <w:r>
+              <w:rPr>
+                <w:lang w:val="en-US"/>
+              </w:rPr>
+            </w:r>
+          </w:p>
+        </w:tc>
+        <w:tc>
+          <w:tcPr>
+            <w:tcW w:w="1769" w:type="dxa"/>
             <w:tcBorders/>
             <w:shd w:color="auto" w:fill="FF0000" w:val="clear"/>
           </w:tcPr>
@@ -1909,23 +1910,23 @@
         <w:trPr/>
         <w:tc>
           <w:tcPr>
-            <w:tcW w:w="3506" w:type="dxa"/>
-            <w:tcBorders/>
-            <w:shd w:fill="auto" w:val="clear"/>
-          </w:tcPr>
-          <w:p>
-            <w:pPr>
-              <w:pStyle w:val="Normal"/>
-              <w:spacing w:lineRule="auto" w:line="240" w:before="0" w:after="0"/>
-              <w:rPr>
-                <w:lang w:val="en-US"/>
-              </w:rPr>
-            </w:pPr>
-            <w:r>
-              <w:rPr>
-                <w:lang w:val="en-US"/>
-              </w:rPr>
-              <w:t xml:space="preserve">pspm_downsample.m             </w:t>
+            <w:tcW w:w="3505" w:type="dxa"/>
+            <w:tcBorders/>
+            <w:shd w:fill="auto" w:val="clear"/>
+          </w:tcPr>
+          <w:p>
+            <w:pPr>
+              <w:pStyle w:val="Normal"/>
+              <w:spacing w:lineRule="auto" w:line="240" w:before="0" w:after="0"/>
+              <w:rPr>
+                <w:lang w:val="en-US"/>
+              </w:rPr>
+            </w:pPr>
+            <w:r>
+              <w:rPr>
+                <w:lang w:val="en-US"/>
+              </w:rPr>
+              <w:t>pspm_downsample.m</w:t>
             </w:r>
           </w:p>
         </w:tc>
@@ -1953,7 +1954,7 @@
         </w:tc>
         <w:tc>
           <w:tcPr>
-            <w:tcW w:w="1768" w:type="dxa"/>
+            <w:tcW w:w="1769" w:type="dxa"/>
             <w:tcBorders/>
             <w:shd w:color="auto" w:fill="FFFF00" w:val="clear"/>
           </w:tcPr>
@@ -1977,23 +1978,23 @@
         <w:trPr/>
         <w:tc>
           <w:tcPr>
-            <w:tcW w:w="3506" w:type="dxa"/>
-            <w:tcBorders/>
-            <w:shd w:fill="auto" w:val="clear"/>
-          </w:tcPr>
-          <w:p>
-            <w:pPr>
-              <w:pStyle w:val="Normal"/>
-              <w:spacing w:lineRule="auto" w:line="240" w:before="0" w:after="0"/>
-              <w:rPr>
-                <w:lang w:val="en-US"/>
-              </w:rPr>
-            </w:pPr>
-            <w:r>
-              <w:rPr>
-                <w:lang w:val="en-US"/>
-              </w:rPr>
-              <w:t xml:space="preserve">pspm_ecg_editor.m             </w:t>
+            <w:tcW w:w="3505" w:type="dxa"/>
+            <w:tcBorders/>
+            <w:shd w:fill="auto" w:val="clear"/>
+          </w:tcPr>
+          <w:p>
+            <w:pPr>
+              <w:pStyle w:val="Normal"/>
+              <w:spacing w:lineRule="auto" w:line="240" w:before="0" w:after="0"/>
+              <w:rPr>
+                <w:lang w:val="en-US"/>
+              </w:rPr>
+            </w:pPr>
+            <w:r>
+              <w:rPr>
+                <w:lang w:val="en-US"/>
+              </w:rPr>
+              <w:t>pspm_ecg_editor.m</w:t>
             </w:r>
           </w:p>
         </w:tc>
@@ -2021,7 +2022,7 @@
         </w:tc>
         <w:tc>
           <w:tcPr>
-            <w:tcW w:w="1768" w:type="dxa"/>
+            <w:tcW w:w="1769" w:type="dxa"/>
             <w:tcBorders/>
             <w:shd w:color="auto" w:fill="FF0000" w:val="clear"/>
           </w:tcPr>
@@ -2045,23 +2046,23 @@
         <w:trPr/>
         <w:tc>
           <w:tcPr>
-            <w:tcW w:w="3506" w:type="dxa"/>
-            <w:tcBorders/>
-            <w:shd w:fill="auto" w:val="clear"/>
-          </w:tcPr>
-          <w:p>
-            <w:pPr>
-              <w:pStyle w:val="Normal"/>
-              <w:spacing w:lineRule="auto" w:line="240" w:before="0" w:after="0"/>
-              <w:rPr>
-                <w:lang w:val="en-US"/>
-              </w:rPr>
-            </w:pPr>
-            <w:r>
-              <w:rPr>
-                <w:lang w:val="en-US"/>
-              </w:rPr>
-              <w:t xml:space="preserve">pspm_ecg2hb.m </w:t>
+            <w:tcW w:w="3505" w:type="dxa"/>
+            <w:tcBorders/>
+            <w:shd w:fill="auto" w:val="clear"/>
+          </w:tcPr>
+          <w:p>
+            <w:pPr>
+              <w:pStyle w:val="Normal"/>
+              <w:spacing w:lineRule="auto" w:line="240" w:before="0" w:after="0"/>
+              <w:rPr>
+                <w:lang w:val="en-US"/>
+              </w:rPr>
+            </w:pPr>
+            <w:r>
+              <w:rPr>
+                <w:lang w:val="en-US"/>
+              </w:rPr>
+              <w:t>pspm_ecg2hb.m</w:t>
             </w:r>
           </w:p>
         </w:tc>
@@ -2109,13 +2110,13 @@
               <w:rPr>
                 <w:lang w:val="en-US"/>
               </w:rPr>
-              <w:t xml:space="preserve"> terminates with error </w:t>
-            </w:r>
-          </w:p>
-        </w:tc>
-        <w:tc>
-          <w:tcPr>
-            <w:tcW w:w="1768" w:type="dxa"/>
+              <w:t xml:space="preserve"> terminates with error</w:t>
+            </w:r>
+          </w:p>
+        </w:tc>
+        <w:tc>
+          <w:tcPr>
+            <w:tcW w:w="1769" w:type="dxa"/>
             <w:tcBorders/>
             <w:shd w:color="auto" w:fill="FF0000" w:val="clear"/>
           </w:tcPr>
@@ -2140,50 +2141,50 @@
         <w:trPr/>
         <w:tc>
           <w:tcPr>
-            <w:tcW w:w="3506" w:type="dxa"/>
-            <w:tcBorders/>
-            <w:shd w:fill="auto" w:val="clear"/>
-          </w:tcPr>
-          <w:p>
-            <w:pPr>
-              <w:pStyle w:val="Normal"/>
-              <w:spacing w:lineRule="auto" w:line="240" w:before="0" w:after="0"/>
-              <w:rPr>
-                <w:lang w:val="en-US"/>
-              </w:rPr>
-            </w:pPr>
-            <w:r>
-              <w:rPr>
-                <w:lang w:val="en-US"/>
-              </w:rPr>
-              <w:t xml:space="preserve">pspm_emg_pp.m                 </w:t>
-            </w:r>
-          </w:p>
-        </w:tc>
-        <w:tc>
-          <w:tcPr>
-            <w:tcW w:w="3969" w:type="dxa"/>
-            <w:tcBorders/>
-            <w:shd w:fill="auto" w:val="clear"/>
-          </w:tcPr>
-          <w:p>
-            <w:pPr>
-              <w:pStyle w:val="Normal"/>
-              <w:spacing w:lineRule="auto" w:line="240" w:before="0" w:after="0"/>
-              <w:rPr>
-                <w:lang w:val="en-US"/>
-              </w:rPr>
-            </w:pPr>
-            <w:r>
-              <w:rPr>
-                <w:lang w:val="en-US"/>
-              </w:rPr>
-            </w:r>
-          </w:p>
-        </w:tc>
-        <w:tc>
-          <w:tcPr>
-            <w:tcW w:w="1768" w:type="dxa"/>
+            <w:tcW w:w="3505" w:type="dxa"/>
+            <w:tcBorders/>
+            <w:shd w:fill="auto" w:val="clear"/>
+          </w:tcPr>
+          <w:p>
+            <w:pPr>
+              <w:pStyle w:val="Normal"/>
+              <w:spacing w:lineRule="auto" w:line="240" w:before="0" w:after="0"/>
+              <w:rPr>
+                <w:lang w:val="en-US"/>
+              </w:rPr>
+            </w:pPr>
+            <w:r>
+              <w:rPr>
+                <w:lang w:val="en-US"/>
+              </w:rPr>
+              <w:t>pspm_emg_pp.m</w:t>
+            </w:r>
+          </w:p>
+        </w:tc>
+        <w:tc>
+          <w:tcPr>
+            <w:tcW w:w="3969" w:type="dxa"/>
+            <w:tcBorders/>
+            <w:shd w:fill="auto" w:val="clear"/>
+          </w:tcPr>
+          <w:p>
+            <w:pPr>
+              <w:pStyle w:val="Normal"/>
+              <w:spacing w:lineRule="auto" w:line="240" w:before="0" w:after="0"/>
+              <w:rPr>
+                <w:lang w:val="en-US"/>
+              </w:rPr>
+            </w:pPr>
+            <w:r>
+              <w:rPr>
+                <w:lang w:val="en-US"/>
+              </w:rPr>
+            </w:r>
+          </w:p>
+        </w:tc>
+        <w:tc>
+          <w:tcPr>
+            <w:tcW w:w="1769" w:type="dxa"/>
             <w:tcBorders/>
             <w:shd w:color="auto" w:fill="00B050" w:val="clear"/>
           </w:tcPr>
@@ -2207,50 +2208,50 @@
         <w:trPr/>
         <w:tc>
           <w:tcPr>
-            <w:tcW w:w="3506" w:type="dxa"/>
-            <w:tcBorders/>
-            <w:shd w:fill="auto" w:val="clear"/>
-          </w:tcPr>
-          <w:p>
-            <w:pPr>
-              <w:pStyle w:val="Normal"/>
-              <w:spacing w:lineRule="auto" w:line="240" w:before="0" w:after="0"/>
-              <w:rPr>
-                <w:lang w:val="en-US"/>
-              </w:rPr>
-            </w:pPr>
-            <w:r>
-              <w:rPr>
-                <w:lang w:val="en-US"/>
-              </w:rPr>
-              <w:t xml:space="preserve">pspm_filtfilt.m               </w:t>
-            </w:r>
-          </w:p>
-        </w:tc>
-        <w:tc>
-          <w:tcPr>
-            <w:tcW w:w="3969" w:type="dxa"/>
-            <w:tcBorders/>
-            <w:shd w:fill="auto" w:val="clear"/>
-          </w:tcPr>
-          <w:p>
-            <w:pPr>
-              <w:pStyle w:val="Normal"/>
-              <w:spacing w:lineRule="auto" w:line="240" w:before="0" w:after="0"/>
-              <w:rPr>
-                <w:lang w:val="en-US"/>
-              </w:rPr>
-            </w:pPr>
-            <w:r>
-              <w:rPr>
-                <w:lang w:val="en-US"/>
-              </w:rPr>
-            </w:r>
-          </w:p>
-        </w:tc>
-        <w:tc>
-          <w:tcPr>
-            <w:tcW w:w="1768" w:type="dxa"/>
+            <w:tcW w:w="3505" w:type="dxa"/>
+            <w:tcBorders/>
+            <w:shd w:fill="auto" w:val="clear"/>
+          </w:tcPr>
+          <w:p>
+            <w:pPr>
+              <w:pStyle w:val="Normal"/>
+              <w:spacing w:lineRule="auto" w:line="240" w:before="0" w:after="0"/>
+              <w:rPr>
+                <w:lang w:val="en-US"/>
+              </w:rPr>
+            </w:pPr>
+            <w:r>
+              <w:rPr>
+                <w:lang w:val="en-US"/>
+              </w:rPr>
+              <w:t>pspm_filtfilt.m</w:t>
+            </w:r>
+          </w:p>
+        </w:tc>
+        <w:tc>
+          <w:tcPr>
+            <w:tcW w:w="3969" w:type="dxa"/>
+            <w:tcBorders/>
+            <w:shd w:fill="auto" w:val="clear"/>
+          </w:tcPr>
+          <w:p>
+            <w:pPr>
+              <w:pStyle w:val="Normal"/>
+              <w:spacing w:lineRule="auto" w:line="240" w:before="0" w:after="0"/>
+              <w:rPr>
+                <w:lang w:val="en-US"/>
+              </w:rPr>
+            </w:pPr>
+            <w:r>
+              <w:rPr>
+                <w:lang w:val="en-US"/>
+              </w:rPr>
+            </w:r>
+          </w:p>
+        </w:tc>
+        <w:tc>
+          <w:tcPr>
+            <w:tcW w:w="1769" w:type="dxa"/>
             <w:tcBorders/>
             <w:shd w:color="auto" w:fill="00B050" w:val="clear"/>
           </w:tcPr>
@@ -2275,23 +2276,23 @@
         <w:trPr/>
         <w:tc>
           <w:tcPr>
-            <w:tcW w:w="3506" w:type="dxa"/>
-            <w:tcBorders/>
-            <w:shd w:fill="auto" w:val="clear"/>
-          </w:tcPr>
-          <w:p>
-            <w:pPr>
-              <w:pStyle w:val="Normal"/>
-              <w:spacing w:lineRule="auto" w:line="240" w:before="0" w:after="0"/>
-              <w:rPr>
-                <w:lang w:val="en-US"/>
-              </w:rPr>
-            </w:pPr>
-            <w:r>
-              <w:rPr>
-                <w:lang w:val="en-US"/>
-              </w:rPr>
-              <w:t xml:space="preserve">pspm_get_blink_l.m            </w:t>
+            <w:tcW w:w="3505" w:type="dxa"/>
+            <w:tcBorders/>
+            <w:shd w:fill="auto" w:val="clear"/>
+          </w:tcPr>
+          <w:p>
+            <w:pPr>
+              <w:pStyle w:val="Normal"/>
+              <w:spacing w:lineRule="auto" w:line="240" w:before="0" w:after="0"/>
+              <w:rPr>
+                <w:lang w:val="en-US"/>
+              </w:rPr>
+            </w:pPr>
+            <w:r>
+              <w:rPr>
+                <w:lang w:val="en-US"/>
+              </w:rPr>
+              <w:t>pspm_get_blink_l.m</w:t>
             </w:r>
           </w:p>
         </w:tc>
@@ -2319,7 +2320,7 @@
         </w:tc>
         <w:tc>
           <w:tcPr>
-            <w:tcW w:w="1768" w:type="dxa"/>
+            <w:tcW w:w="1769" w:type="dxa"/>
             <w:tcBorders/>
             <w:shd w:color="auto" w:fill="00B050" w:val="clear"/>
           </w:tcPr>
@@ -2343,23 +2344,23 @@
         <w:trPr/>
         <w:tc>
           <w:tcPr>
-            <w:tcW w:w="3506" w:type="dxa"/>
-            <w:tcBorders/>
-            <w:shd w:fill="auto" w:val="clear"/>
-          </w:tcPr>
-          <w:p>
-            <w:pPr>
-              <w:pStyle w:val="Normal"/>
-              <w:spacing w:lineRule="auto" w:line="240" w:before="0" w:after="0"/>
-              <w:rPr>
-                <w:lang w:val="en-US"/>
-              </w:rPr>
-            </w:pPr>
-            <w:r>
-              <w:rPr>
-                <w:lang w:val="en-US"/>
-              </w:rPr>
-              <w:t xml:space="preserve">pspm_get_blink_r.m            </w:t>
+            <w:tcW w:w="3505" w:type="dxa"/>
+            <w:tcBorders/>
+            <w:shd w:fill="auto" w:val="clear"/>
+          </w:tcPr>
+          <w:p>
+            <w:pPr>
+              <w:pStyle w:val="Normal"/>
+              <w:spacing w:lineRule="auto" w:line="240" w:before="0" w:after="0"/>
+              <w:rPr>
+                <w:lang w:val="en-US"/>
+              </w:rPr>
+            </w:pPr>
+            <w:r>
+              <w:rPr>
+                <w:lang w:val="en-US"/>
+              </w:rPr>
+              <w:t>pspm_get_blink_r.m</w:t>
             </w:r>
           </w:p>
         </w:tc>
@@ -2387,7 +2388,7 @@
         </w:tc>
         <w:tc>
           <w:tcPr>
-            <w:tcW w:w="1768" w:type="dxa"/>
+            <w:tcW w:w="1769" w:type="dxa"/>
             <w:tcBorders/>
             <w:shd w:color="auto" w:fill="00B050" w:val="clear"/>
           </w:tcPr>
@@ -2411,23 +2412,23 @@
         <w:trPr/>
         <w:tc>
           <w:tcPr>
-            <w:tcW w:w="3506" w:type="dxa"/>
-            <w:tcBorders/>
-            <w:shd w:fill="auto" w:val="clear"/>
-          </w:tcPr>
-          <w:p>
-            <w:pPr>
-              <w:pStyle w:val="Normal"/>
-              <w:spacing w:lineRule="auto" w:line="240" w:before="0" w:after="0"/>
-              <w:rPr>
-                <w:lang w:val="en-US"/>
-              </w:rPr>
-            </w:pPr>
-            <w:r>
-              <w:rPr>
-                <w:lang w:val="en-US"/>
-              </w:rPr>
-              <w:t xml:space="preserve">pspm_get_cnt.m             </w:t>
+            <w:tcW w:w="3505" w:type="dxa"/>
+            <w:tcBorders/>
+            <w:shd w:fill="auto" w:val="clear"/>
+          </w:tcPr>
+          <w:p>
+            <w:pPr>
+              <w:pStyle w:val="Normal"/>
+              <w:spacing w:lineRule="auto" w:line="240" w:before="0" w:after="0"/>
+              <w:rPr>
+                <w:lang w:val="en-US"/>
+              </w:rPr>
+            </w:pPr>
+            <w:r>
+              <w:rPr>
+                <w:lang w:val="en-US"/>
+              </w:rPr>
+              <w:t>pspm_get_cnt.m</w:t>
             </w:r>
           </w:p>
         </w:tc>
@@ -2455,7 +2456,7 @@
         </w:tc>
         <w:tc>
           <w:tcPr>
-            <w:tcW w:w="1768" w:type="dxa"/>
+            <w:tcW w:w="1769" w:type="dxa"/>
             <w:tcBorders/>
             <w:shd w:color="auto" w:fill="00B050" w:val="clear"/>
           </w:tcPr>
@@ -2479,23 +2480,23 @@
         <w:trPr/>
         <w:tc>
           <w:tcPr>
-            <w:tcW w:w="3506" w:type="dxa"/>
-            <w:tcBorders/>
-            <w:shd w:fill="auto" w:val="clear"/>
-          </w:tcPr>
-          <w:p>
-            <w:pPr>
-              <w:pStyle w:val="Normal"/>
-              <w:spacing w:lineRule="auto" w:line="240" w:before="0" w:after="0"/>
-              <w:rPr>
-                <w:lang w:val="en-US"/>
-              </w:rPr>
-            </w:pPr>
-            <w:r>
-              <w:rPr>
-                <w:lang w:val="en-US"/>
-              </w:rPr>
-              <w:t xml:space="preserve">pspm_get_custom.m             </w:t>
+            <w:tcW w:w="3505" w:type="dxa"/>
+            <w:tcBorders/>
+            <w:shd w:fill="auto" w:val="clear"/>
+          </w:tcPr>
+          <w:p>
+            <w:pPr>
+              <w:pStyle w:val="Normal"/>
+              <w:spacing w:lineRule="auto" w:line="240" w:before="0" w:after="0"/>
+              <w:rPr>
+                <w:lang w:val="en-US"/>
+              </w:rPr>
+            </w:pPr>
+            <w:r>
+              <w:rPr>
+                <w:lang w:val="en-US"/>
+              </w:rPr>
+              <w:t>pspm_get_custom.m</w:t>
             </w:r>
           </w:p>
         </w:tc>
@@ -2523,7 +2524,7 @@
         </w:tc>
         <w:tc>
           <w:tcPr>
-            <w:tcW w:w="1768" w:type="dxa"/>
+            <w:tcW w:w="1769" w:type="dxa"/>
             <w:tcBorders/>
             <w:shd w:color="auto" w:fill="00B050" w:val="clear"/>
           </w:tcPr>
@@ -2547,7 +2548,7 @@
         <w:trPr/>
         <w:tc>
           <w:tcPr>
-            <w:tcW w:w="3506" w:type="dxa"/>
+            <w:tcW w:w="3505" w:type="dxa"/>
             <w:tcBorders/>
             <w:shd w:fill="auto" w:val="clear"/>
           </w:tcPr>
@@ -2591,7 +2592,7 @@
         </w:tc>
         <w:tc>
           <w:tcPr>
-            <w:tcW w:w="1768" w:type="dxa"/>
+            <w:tcW w:w="1769" w:type="dxa"/>
             <w:tcBorders/>
             <w:shd w:color="auto" w:fill="00B050" w:val="clear"/>
           </w:tcPr>
@@ -2615,7 +2616,7 @@
         <w:trPr/>
         <w:tc>
           <w:tcPr>
-            <w:tcW w:w="3506" w:type="dxa"/>
+            <w:tcW w:w="3505" w:type="dxa"/>
             <w:tcBorders/>
             <w:shd w:fill="auto" w:val="clear"/>
           </w:tcPr>
@@ -2659,7 +2660,7 @@
         </w:tc>
         <w:tc>
           <w:tcPr>
-            <w:tcW w:w="1768" w:type="dxa"/>
+            <w:tcW w:w="1769" w:type="dxa"/>
             <w:tcBorders/>
             <w:shd w:color="auto" w:fill="00B050" w:val="clear"/>
           </w:tcPr>
@@ -2683,7 +2684,7 @@
         <w:trPr/>
         <w:tc>
           <w:tcPr>
-            <w:tcW w:w="3506" w:type="dxa"/>
+            <w:tcW w:w="3505" w:type="dxa"/>
             <w:tcBorders/>
             <w:shd w:fill="auto" w:val="clear"/>
           </w:tcPr>
@@ -2727,7 +2728,7 @@
         </w:tc>
         <w:tc>
           <w:tcPr>
-            <w:tcW w:w="1768" w:type="dxa"/>
+            <w:tcW w:w="1769" w:type="dxa"/>
             <w:tcBorders/>
             <w:shd w:color="auto" w:fill="00B050" w:val="clear"/>
           </w:tcPr>
@@ -2751,7 +2752,7 @@
         <w:trPr/>
         <w:tc>
           <w:tcPr>
-            <w:tcW w:w="3506" w:type="dxa"/>
+            <w:tcW w:w="3505" w:type="dxa"/>
             <w:tcBorders/>
             <w:shd w:fill="auto" w:val="clear"/>
           </w:tcPr>
@@ -2795,7 +2796,7 @@
         </w:tc>
         <w:tc>
           <w:tcPr>
-            <w:tcW w:w="1768" w:type="dxa"/>
+            <w:tcW w:w="1769" w:type="dxa"/>
             <w:tcBorders/>
             <w:shd w:color="auto" w:fill="00B050" w:val="clear"/>
           </w:tcPr>
@@ -2819,7 +2820,7 @@
         <w:trPr/>
         <w:tc>
           <w:tcPr>
-            <w:tcW w:w="3506" w:type="dxa"/>
+            <w:tcW w:w="3505" w:type="dxa"/>
             <w:tcBorders/>
             <w:shd w:fill="auto" w:val="clear"/>
           </w:tcPr>
@@ -2863,7 +2864,7 @@
         </w:tc>
         <w:tc>
           <w:tcPr>
-            <w:tcW w:w="1768" w:type="dxa"/>
+            <w:tcW w:w="1769" w:type="dxa"/>
             <w:tcBorders/>
             <w:shd w:color="auto" w:fill="00B050" w:val="clear"/>
           </w:tcPr>
@@ -2887,7 +2888,7 @@
         <w:trPr/>
         <w:tc>
           <w:tcPr>
-            <w:tcW w:w="3506" w:type="dxa"/>
+            <w:tcW w:w="3505" w:type="dxa"/>
             <w:tcBorders/>
             <w:shd w:fill="auto" w:val="clear"/>
           </w:tcPr>
@@ -2931,7 +2932,7 @@
         </w:tc>
         <w:tc>
           <w:tcPr>
-            <w:tcW w:w="1768" w:type="dxa"/>
+            <w:tcW w:w="1769" w:type="dxa"/>
             <w:tcBorders/>
             <w:shd w:color="auto" w:fill="00B050" w:val="clear"/>
           </w:tcPr>
@@ -2955,7 +2956,7 @@
         <w:trPr/>
         <w:tc>
           <w:tcPr>
-            <w:tcW w:w="3506" w:type="dxa"/>
+            <w:tcW w:w="3505" w:type="dxa"/>
             <w:tcBorders/>
             <w:shd w:fill="auto" w:val="clear"/>
           </w:tcPr>
@@ -2999,7 +3000,7 @@
         </w:tc>
         <w:tc>
           <w:tcPr>
-            <w:tcW w:w="1768" w:type="dxa"/>
+            <w:tcW w:w="1769" w:type="dxa"/>
             <w:tcBorders/>
             <w:shd w:color="auto" w:fill="FFFF00" w:val="clear"/>
           </w:tcPr>
@@ -3023,7 +3024,7 @@
         <w:trPr/>
         <w:tc>
           <w:tcPr>
-            <w:tcW w:w="3506" w:type="dxa"/>
+            <w:tcW w:w="3505" w:type="dxa"/>
             <w:tcBorders/>
             <w:shd w:fill="auto" w:val="clear"/>
           </w:tcPr>
@@ -3067,7 +3068,7 @@
         </w:tc>
         <w:tc>
           <w:tcPr>
-            <w:tcW w:w="1768" w:type="dxa"/>
+            <w:tcW w:w="1769" w:type="dxa"/>
             <w:tcBorders/>
             <w:shd w:color="auto" w:fill="00B050" w:val="clear"/>
           </w:tcPr>
@@ -3091,7 +3092,7 @@
         <w:trPr/>
         <w:tc>
           <w:tcPr>
-            <w:tcW w:w="3506" w:type="dxa"/>
+            <w:tcW w:w="3505" w:type="dxa"/>
             <w:tcBorders/>
             <w:shd w:fill="auto" w:val="clear"/>
           </w:tcPr>
@@ -3135,7 +3136,7 @@
         </w:tc>
         <w:tc>
           <w:tcPr>
-            <w:tcW w:w="1768" w:type="dxa"/>
+            <w:tcW w:w="1769" w:type="dxa"/>
             <w:tcBorders/>
             <w:shd w:color="auto" w:fill="00B050" w:val="clear"/>
           </w:tcPr>
@@ -3159,7 +3160,7 @@
         <w:trPr/>
         <w:tc>
           <w:tcPr>
-            <w:tcW w:w="3506" w:type="dxa"/>
+            <w:tcW w:w="3505" w:type="dxa"/>
             <w:tcBorders/>
             <w:shd w:fill="auto" w:val="clear"/>
           </w:tcPr>
@@ -3203,7 +3204,7 @@
         </w:tc>
         <w:tc>
           <w:tcPr>
-            <w:tcW w:w="1768" w:type="dxa"/>
+            <w:tcW w:w="1769" w:type="dxa"/>
             <w:tcBorders/>
             <w:shd w:color="auto" w:fill="FF0000" w:val="clear"/>
           </w:tcPr>
@@ -3227,7 +3228,7 @@
         <w:trPr/>
         <w:tc>
           <w:tcPr>
-            <w:tcW w:w="3506" w:type="dxa"/>
+            <w:tcW w:w="3505" w:type="dxa"/>
             <w:tcBorders/>
             <w:shd w:fill="auto" w:val="clear"/>
           </w:tcPr>
@@ -3271,7 +3272,7 @@
         </w:tc>
         <w:tc>
           <w:tcPr>
-            <w:tcW w:w="1768" w:type="dxa"/>
+            <w:tcW w:w="1769" w:type="dxa"/>
             <w:tcBorders/>
             <w:shd w:color="auto" w:fill="00B050" w:val="clear"/>
           </w:tcPr>
@@ -3295,7 +3296,7 @@
         <w:trPr/>
         <w:tc>
           <w:tcPr>
-            <w:tcW w:w="3506" w:type="dxa"/>
+            <w:tcW w:w="3505" w:type="dxa"/>
             <w:tcBorders/>
             <w:shd w:fill="auto" w:val="clear"/>
           </w:tcPr>
@@ -3339,7 +3340,7 @@
         </w:tc>
         <w:tc>
           <w:tcPr>
-            <w:tcW w:w="1768" w:type="dxa"/>
+            <w:tcW w:w="1769" w:type="dxa"/>
             <w:tcBorders/>
             <w:shd w:color="auto" w:fill="00B050" w:val="clear"/>
           </w:tcPr>
@@ -3363,7 +3364,7 @@
         <w:trPr/>
         <w:tc>
           <w:tcPr>
-            <w:tcW w:w="3506" w:type="dxa"/>
+            <w:tcW w:w="3505" w:type="dxa"/>
             <w:tcBorders/>
             <w:shd w:fill="auto" w:val="clear"/>
           </w:tcPr>
@@ -3407,7 +3408,7 @@
         </w:tc>
         <w:tc>
           <w:tcPr>
-            <w:tcW w:w="1768" w:type="dxa"/>
+            <w:tcW w:w="1769" w:type="dxa"/>
             <w:tcBorders/>
             <w:shd w:color="auto" w:fill="00B050" w:val="clear"/>
           </w:tcPr>
@@ -3431,7 +3432,7 @@
         <w:trPr/>
         <w:tc>
           <w:tcPr>
-            <w:tcW w:w="3506" w:type="dxa"/>
+            <w:tcW w:w="3505" w:type="dxa"/>
             <w:tcBorders/>
             <w:shd w:fill="auto" w:val="clear"/>
           </w:tcPr>
@@ -3475,7 +3476,7 @@
         </w:tc>
         <w:tc>
           <w:tcPr>
-            <w:tcW w:w="1768" w:type="dxa"/>
+            <w:tcW w:w="1769" w:type="dxa"/>
             <w:tcBorders/>
             <w:shd w:color="auto" w:fill="00B050" w:val="clear"/>
           </w:tcPr>
@@ -3499,7 +3500,7 @@
         <w:trPr/>
         <w:tc>
           <w:tcPr>
-            <w:tcW w:w="3506" w:type="dxa"/>
+            <w:tcW w:w="3505" w:type="dxa"/>
             <w:tcBorders/>
             <w:shd w:fill="auto" w:val="clear"/>
           </w:tcPr>
@@ -3543,7 +3544,7 @@
         </w:tc>
         <w:tc>
           <w:tcPr>
-            <w:tcW w:w="1768" w:type="dxa"/>
+            <w:tcW w:w="1769" w:type="dxa"/>
             <w:tcBorders/>
             <w:shd w:color="auto" w:fill="00B050" w:val="clear"/>
           </w:tcPr>
@@ -3567,7 +3568,7 @@
         <w:trPr/>
         <w:tc>
           <w:tcPr>
-            <w:tcW w:w="3506" w:type="dxa"/>
+            <w:tcW w:w="3505" w:type="dxa"/>
             <w:tcBorders/>
             <w:shd w:fill="auto" w:val="clear"/>
           </w:tcPr>
@@ -3611,7 +3612,7 @@
         </w:tc>
         <w:tc>
           <w:tcPr>
-            <w:tcW w:w="1768" w:type="dxa"/>
+            <w:tcW w:w="1769" w:type="dxa"/>
             <w:tcBorders/>
             <w:shd w:color="auto" w:fill="FF0000" w:val="clear"/>
           </w:tcPr>
@@ -3637,7 +3638,7 @@
         </w:trPr>
         <w:tc>
           <w:tcPr>
-            <w:tcW w:w="3506" w:type="dxa"/>
+            <w:tcW w:w="3505" w:type="dxa"/>
             <w:tcBorders/>
             <w:shd w:fill="auto" w:val="clear"/>
           </w:tcPr>
@@ -3675,13 +3676,13 @@
               <w:rPr>
                 <w:lang w:val="en-US"/>
               </w:rPr>
-              <w:t xml:space="preserve">Contained in batch editor </w:t>
-            </w:r>
-          </w:p>
-        </w:tc>
-        <w:tc>
-          <w:tcPr>
-            <w:tcW w:w="1768" w:type="dxa"/>
+              <w:t>Contained in batch editor</w:t>
+            </w:r>
+          </w:p>
+        </w:tc>
+        <w:tc>
+          <w:tcPr>
+            <w:tcW w:w="1769" w:type="dxa"/>
             <w:tcBorders/>
             <w:shd w:color="auto" w:fill="FFFF00" w:val="clear"/>
           </w:tcPr>
@@ -3705,7 +3706,7 @@
         <w:trPr/>
         <w:tc>
           <w:tcPr>
-            <w:tcW w:w="3506" w:type="dxa"/>
+            <w:tcW w:w="3505" w:type="dxa"/>
             <w:tcBorders/>
             <w:shd w:fill="auto" w:val="clear"/>
           </w:tcPr>
@@ -3749,7 +3750,7 @@
         </w:tc>
         <w:tc>
           <w:tcPr>
-            <w:tcW w:w="1768" w:type="dxa"/>
+            <w:tcW w:w="1769" w:type="dxa"/>
             <w:tcBorders/>
             <w:shd w:color="auto" w:fill="FFFF00" w:val="clear"/>
           </w:tcPr>
@@ -3773,7 +3774,7 @@
         <w:trPr/>
         <w:tc>
           <w:tcPr>
-            <w:tcW w:w="3506" w:type="dxa"/>
+            <w:tcW w:w="3505" w:type="dxa"/>
             <w:tcBorders/>
             <w:shd w:fill="auto" w:val="clear"/>
           </w:tcPr>
@@ -3817,7 +3818,7 @@
         </w:tc>
         <w:tc>
           <w:tcPr>
-            <w:tcW w:w="1768" w:type="dxa"/>
+            <w:tcW w:w="1769" w:type="dxa"/>
             <w:tcBorders/>
             <w:shd w:color="auto" w:fill="FFFF00" w:val="clear"/>
           </w:tcPr>
@@ -3841,7 +3842,7 @@
         <w:trPr/>
         <w:tc>
           <w:tcPr>
-            <w:tcW w:w="3506" w:type="dxa"/>
+            <w:tcW w:w="3505" w:type="dxa"/>
             <w:tcBorders/>
             <w:shd w:fill="auto" w:val="clear"/>
           </w:tcPr>
@@ -3884,7 +3885,7 @@
         </w:tc>
         <w:tc>
           <w:tcPr>
-            <w:tcW w:w="1768" w:type="dxa"/>
+            <w:tcW w:w="1769" w:type="dxa"/>
             <w:tcBorders/>
             <w:shd w:color="auto" w:fill="00B050" w:val="clear"/>
           </w:tcPr>
@@ -3908,7 +3909,7 @@
         <w:trPr/>
         <w:tc>
           <w:tcPr>
-            <w:tcW w:w="3506" w:type="dxa"/>
+            <w:tcW w:w="3505" w:type="dxa"/>
             <w:tcBorders/>
             <w:shd w:fill="auto" w:val="clear"/>
           </w:tcPr>
@@ -3952,7 +3953,7 @@
         </w:tc>
         <w:tc>
           <w:tcPr>
-            <w:tcW w:w="1768" w:type="dxa"/>
+            <w:tcW w:w="1769" w:type="dxa"/>
             <w:tcBorders/>
             <w:shd w:color="auto" w:fill="FFFF00" w:val="clear"/>
           </w:tcPr>
@@ -3983,7 +3984,7 @@
         <w:trPr/>
         <w:tc>
           <w:tcPr>
-            <w:tcW w:w="3506" w:type="dxa"/>
+            <w:tcW w:w="3505" w:type="dxa"/>
             <w:tcBorders/>
             <w:shd w:fill="auto" w:val="clear"/>
           </w:tcPr>
@@ -4029,7 +4030,7 @@
         </w:tc>
         <w:tc>
           <w:tcPr>
-            <w:tcW w:w="1768" w:type="dxa"/>
+            <w:tcW w:w="1769" w:type="dxa"/>
             <w:tcBorders/>
             <w:shd w:color="auto" w:fill="FFFF00" w:val="clear"/>
           </w:tcPr>
@@ -4053,7 +4054,7 @@
         <w:trPr/>
         <w:tc>
           <w:tcPr>
-            <w:tcW w:w="3506" w:type="dxa"/>
+            <w:tcW w:w="3505" w:type="dxa"/>
             <w:tcBorders/>
             <w:shd w:fill="auto" w:val="clear"/>
           </w:tcPr>
@@ -4099,7 +4100,7 @@
         </w:tc>
         <w:tc>
           <w:tcPr>
-            <w:tcW w:w="1768" w:type="dxa"/>
+            <w:tcW w:w="1769" w:type="dxa"/>
             <w:tcBorders/>
             <w:shd w:color="auto" w:fill="FFFF00" w:val="clear"/>
           </w:tcPr>
@@ -4123,7 +4124,7 @@
         <w:trPr/>
         <w:tc>
           <w:tcPr>
-            <w:tcW w:w="3506" w:type="dxa"/>
+            <w:tcW w:w="3505" w:type="dxa"/>
             <w:tcBorders/>
             <w:shd w:fill="auto" w:val="clear"/>
           </w:tcPr>
@@ -4169,7 +4170,7 @@
         </w:tc>
         <w:tc>
           <w:tcPr>
-            <w:tcW w:w="1768" w:type="dxa"/>
+            <w:tcW w:w="1769" w:type="dxa"/>
             <w:tcBorders/>
             <w:shd w:color="auto" w:fill="FFFF00" w:val="clear"/>
           </w:tcPr>
@@ -4193,7 +4194,7 @@
         <w:trPr/>
         <w:tc>
           <w:tcPr>
-            <w:tcW w:w="3506" w:type="dxa"/>
+            <w:tcW w:w="3505" w:type="dxa"/>
             <w:tcBorders/>
             <w:shd w:fill="auto" w:val="clear"/>
           </w:tcPr>
@@ -4237,7 +4238,7 @@
         </w:tc>
         <w:tc>
           <w:tcPr>
-            <w:tcW w:w="1768" w:type="dxa"/>
+            <w:tcW w:w="1769" w:type="dxa"/>
             <w:tcBorders/>
             <w:shd w:color="auto" w:fill="FFFF00" w:val="clear"/>
           </w:tcPr>
@@ -4261,7 +4262,7 @@
         <w:trPr/>
         <w:tc>
           <w:tcPr>
-            <w:tcW w:w="3506" w:type="dxa"/>
+            <w:tcW w:w="3505" w:type="dxa"/>
             <w:tcBorders/>
             <w:shd w:fill="auto" w:val="clear"/>
           </w:tcPr>
@@ -4305,7 +4306,7 @@
         </w:tc>
         <w:tc>
           <w:tcPr>
-            <w:tcW w:w="1768" w:type="dxa"/>
+            <w:tcW w:w="1769" w:type="dxa"/>
             <w:tcBorders/>
             <w:shd w:color="auto" w:fill="FFFF00" w:val="clear"/>
           </w:tcPr>
@@ -4329,7 +4330,7 @@
         <w:trPr/>
         <w:tc>
           <w:tcPr>
-            <w:tcW w:w="3506" w:type="dxa"/>
+            <w:tcW w:w="3505" w:type="dxa"/>
             <w:tcBorders/>
             <w:shd w:fill="auto" w:val="clear"/>
           </w:tcPr>
@@ -4373,7 +4374,7 @@
         </w:tc>
         <w:tc>
           <w:tcPr>
-            <w:tcW w:w="1768" w:type="dxa"/>
+            <w:tcW w:w="1769" w:type="dxa"/>
             <w:tcBorders/>
             <w:shd w:color="auto" w:fill="FF0000" w:val="clear"/>
           </w:tcPr>
@@ -4397,7 +4398,7 @@
         <w:trPr/>
         <w:tc>
           <w:tcPr>
-            <w:tcW w:w="3506" w:type="dxa"/>
+            <w:tcW w:w="3505" w:type="dxa"/>
             <w:tcBorders/>
             <w:shd w:fill="auto" w:val="clear"/>
           </w:tcPr>
@@ -4443,7 +4444,7 @@
         </w:tc>
         <w:tc>
           <w:tcPr>
-            <w:tcW w:w="1768" w:type="dxa"/>
+            <w:tcW w:w="1769" w:type="dxa"/>
             <w:tcBorders/>
             <w:shd w:color="auto" w:fill="FF0000" w:val="clear"/>
           </w:tcPr>
@@ -4467,7 +4468,7 @@
         <w:trPr/>
         <w:tc>
           <w:tcPr>
-            <w:tcW w:w="3506" w:type="dxa"/>
+            <w:tcW w:w="3505" w:type="dxa"/>
             <w:tcBorders/>
             <w:shd w:fill="auto" w:val="clear"/>
           </w:tcPr>
@@ -4510,7 +4511,7 @@
         </w:tc>
         <w:tc>
           <w:tcPr>
-            <w:tcW w:w="1768" w:type="dxa"/>
+            <w:tcW w:w="1769" w:type="dxa"/>
             <w:tcBorders/>
             <w:shd w:color="auto" w:fill="FF0000" w:val="clear"/>
           </w:tcPr>
@@ -4534,7 +4535,7 @@
         <w:trPr/>
         <w:tc>
           <w:tcPr>
-            <w:tcW w:w="3506" w:type="dxa"/>
+            <w:tcW w:w="3505" w:type="dxa"/>
             <w:tcBorders/>
             <w:shd w:fill="auto" w:val="clear"/>
           </w:tcPr>
@@ -4577,7 +4578,7 @@
         </w:tc>
         <w:tc>
           <w:tcPr>
-            <w:tcW w:w="1768" w:type="dxa"/>
+            <w:tcW w:w="1769" w:type="dxa"/>
             <w:tcBorders/>
             <w:shd w:color="auto" w:fill="FF0000" w:val="clear"/>
           </w:tcPr>
@@ -4601,7 +4602,7 @@
         <w:trPr/>
         <w:tc>
           <w:tcPr>
-            <w:tcW w:w="3506" w:type="dxa"/>
+            <w:tcW w:w="3505" w:type="dxa"/>
             <w:tcBorders/>
             <w:shd w:fill="auto" w:val="clear"/>
           </w:tcPr>
@@ -4644,7 +4645,7 @@
         </w:tc>
         <w:tc>
           <w:tcPr>
-            <w:tcW w:w="1768" w:type="dxa"/>
+            <w:tcW w:w="1769" w:type="dxa"/>
             <w:tcBorders/>
             <w:shd w:color="auto" w:fill="FF0000" w:val="clear"/>
           </w:tcPr>
@@ -4668,7 +4669,7 @@
         <w:trPr/>
         <w:tc>
           <w:tcPr>
-            <w:tcW w:w="3506" w:type="dxa"/>
+            <w:tcW w:w="3505" w:type="dxa"/>
             <w:tcBorders/>
             <w:shd w:fill="auto" w:val="clear"/>
           </w:tcPr>
@@ -4711,7 +4712,7 @@
         </w:tc>
         <w:tc>
           <w:tcPr>
-            <w:tcW w:w="1768" w:type="dxa"/>
+            <w:tcW w:w="1769" w:type="dxa"/>
             <w:tcBorders/>
             <w:shd w:color="auto" w:fill="FF0000" w:val="clear"/>
           </w:tcPr>
@@ -4736,7 +4737,7 @@
         <w:trPr/>
         <w:tc>
           <w:tcPr>
-            <w:tcW w:w="3506" w:type="dxa"/>
+            <w:tcW w:w="3505" w:type="dxa"/>
             <w:tcBorders/>
             <w:shd w:fill="auto" w:val="clear"/>
           </w:tcPr>
@@ -4779,7 +4780,7 @@
         </w:tc>
         <w:tc>
           <w:tcPr>
-            <w:tcW w:w="1768" w:type="dxa"/>
+            <w:tcW w:w="1769" w:type="dxa"/>
             <w:tcBorders/>
             <w:shd w:color="auto" w:fill="FF0000" w:val="clear"/>
           </w:tcPr>
@@ -4795,16 +4796,16 @@
               <w:rPr>
                 <w:lang w:val="en-US"/>
               </w:rPr>
-              <w:t>DONE</w:t>
-            </w:r>
-          </w:p>
-        </w:tc>
-      </w:tr>
-      <w:tr>
-        <w:trPr/>
-        <w:tc>
-          <w:tcPr>
-            <w:tcW w:w="3506" w:type="dxa"/>
+              <w:t>DONE??</w:t>
+            </w:r>
+          </w:p>
+        </w:tc>
+      </w:tr>
+      <w:tr>
+        <w:trPr/>
+        <w:tc>
+          <w:tcPr>
+            <w:tcW w:w="3505" w:type="dxa"/>
             <w:tcBorders/>
             <w:shd w:fill="auto" w:val="clear"/>
           </w:tcPr>
@@ -4847,7 +4848,7 @@
         </w:tc>
         <w:tc>
           <w:tcPr>
-            <w:tcW w:w="1768" w:type="dxa"/>
+            <w:tcW w:w="1769" w:type="dxa"/>
             <w:tcBorders/>
             <w:shd w:color="auto" w:fill="00B050" w:val="clear"/>
           </w:tcPr>
@@ -4871,7 +4872,7 @@
         <w:trPr/>
         <w:tc>
           <w:tcPr>
-            <w:tcW w:w="3506" w:type="dxa"/>
+            <w:tcW w:w="3505" w:type="dxa"/>
             <w:tcBorders/>
             <w:shd w:fill="auto" w:val="clear"/>
           </w:tcPr>
@@ -4915,7 +4916,7 @@
         </w:tc>
         <w:tc>
           <w:tcPr>
-            <w:tcW w:w="1768" w:type="dxa"/>
+            <w:tcW w:w="1769" w:type="dxa"/>
             <w:tcBorders/>
             <w:shd w:color="auto" w:fill="FFFF00" w:val="clear"/>
           </w:tcPr>
@@ -4939,7 +4940,7 @@
         <w:trPr/>
         <w:tc>
           <w:tcPr>
-            <w:tcW w:w="3506" w:type="dxa"/>
+            <w:tcW w:w="3505" w:type="dxa"/>
             <w:tcBorders/>
             <w:shd w:fill="auto" w:val="clear"/>
           </w:tcPr>
@@ -4983,7 +4984,7 @@
         </w:tc>
         <w:tc>
           <w:tcPr>
-            <w:tcW w:w="1768" w:type="dxa"/>
+            <w:tcW w:w="1769" w:type="dxa"/>
             <w:tcBorders/>
             <w:shd w:color="auto" w:fill="FFFF00" w:val="clear"/>
           </w:tcPr>
@@ -5009,7 +5010,7 @@
         </w:trPr>
         <w:tc>
           <w:tcPr>
-            <w:tcW w:w="3506" w:type="dxa"/>
+            <w:tcW w:w="3505" w:type="dxa"/>
             <w:tcBorders/>
             <w:shd w:fill="auto" w:val="clear"/>
           </w:tcPr>
@@ -5052,7 +5053,7 @@
         </w:tc>
         <w:tc>
           <w:tcPr>
-            <w:tcW w:w="1768" w:type="dxa"/>
+            <w:tcW w:w="1769" w:type="dxa"/>
             <w:tcBorders/>
             <w:shd w:color="auto" w:fill="00B050" w:val="clear"/>
           </w:tcPr>
@@ -5115,7 +5116,7 @@
     <w:sectPr>
       <w:type w:val="nextPage"/>
       <w:pgSz w:w="11906" w:h="16838"/>
-      <w:pgMar w:left="1417" w:right="1417" w:header="0" w:top="1417" w:footer="0" w:bottom="1134" w:gutter="0"/>
+      <w:pgMar w:left="1417" w:right="1417" w:gutter="0" w:header="0" w:top="1417" w:footer="0" w:bottom="1134"/>
       <w:pgNumType w:fmt="decimal"/>
       <w:formProt w:val="false"/>
       <w:textDirection w:val="lrTb"/>
@@ -5126,12 +5127,17 @@
 </file>
 
 <file path=word/comments.xml><?xml version="1.0" encoding="utf-8"?>
-<w:comments xmlns:o="urn:schemas-microsoft-com:office:office" xmlns:r="http://schemas.openxmlformats.org/officeDocument/2006/relationships" xmlns:v="urn:schemas-microsoft-com:vml" xmlns:w="http://schemas.openxmlformats.org/wordprocessingml/2006/main" xmlns:w10="urn:schemas-microsoft-com:office:word" xmlns:wp="http://schemas.openxmlformats.org/drawingml/2006/wordprocessingDrawing" xmlns:wps="http://schemas.microsoft.com/office/word/2010/wordprocessingShape" xmlns:wpg="http://schemas.microsoft.com/office/word/2010/wordprocessingGroup" xmlns:mc="http://schemas.openxmlformats.org/markup-compatibility/2006" xmlns:wp14="http://schemas.microsoft.com/office/word/2010/wordprocessingDrawing" xmlns:w14="http://schemas.microsoft.com/office/word/2010/wordml" mc:Ignorable="w14 wp14">
+<w:comments xmlns:o="urn:schemas-microsoft-com:office:office" xmlns:r="http://schemas.openxmlformats.org/officeDocument/2006/relationships" xmlns:v="urn:schemas-microsoft-com:vml" xmlns:w="http://schemas.openxmlformats.org/wordprocessingml/2006/main" xmlns:w10="urn:schemas-microsoft-com:office:word" xmlns:wp="http://schemas.openxmlformats.org/drawingml/2006/wordprocessingDrawing" xmlns:pic="http://schemas.openxmlformats.org/drawingml/2006/picture" xmlns:wps="http://schemas.microsoft.com/office/word/2010/wordprocessingShape" xmlns:wpg="http://schemas.microsoft.com/office/word/2010/wordprocessingGroup" xmlns:mc="http://schemas.openxmlformats.org/markup-compatibility/2006" xmlns:wp14="http://schemas.microsoft.com/office/word/2010/wordprocessingDrawing" xmlns:w14="http://schemas.microsoft.com/office/word/2010/wordml" xmlns:w15="http://schemas.microsoft.com/office/word/2012/wordml" mc:Ignorable="w14 wp14 w15">
   <w:comment w:id="0" w:author="Praktikant Bach" w:date="2018-09-19T08:53:00Z" w:initials="PB">
     <w:p>
+      <w:pPr>
+        <w:overflowPunct w:val="false"/>
+        <w:spacing w:before="0" w:after="0" w:lineRule="auto" w:line="240"/>
+        <w:rPr/>
+      </w:pPr>
       <w:r>
         <w:rPr>
-          <w:rFonts w:ascii="Times New Roman" w:hAnsi="Times New Roman" w:eastAsia="DejaVu Sans" w:cs="DejaVu Sans"/>
+          <w:rFonts w:eastAsia="DejaVu Sans" w:cs="DejaVu Sans" w:ascii="Times New Roman" w:hAnsi="Times New Roman"/>
           <w:sz w:val="24"/>
           <w:szCs w:val="24"/>
           <w:lang w:val="en-US" w:eastAsia="en-US" w:bidi="en-US"/>
@@ -5142,9 +5148,14 @@
   </w:comment>
   <w:comment w:id="1" w:author="Praktikant Bach" w:date="2019-04-05T11:50:00Z" w:initials="PB">
     <w:p>
+      <w:pPr>
+        <w:overflowPunct w:val="false"/>
+        <w:spacing w:before="0" w:after="0" w:lineRule="auto" w:line="240"/>
+        <w:rPr/>
+      </w:pPr>
       <w:r>
         <w:rPr>
-          <w:rFonts w:ascii="Times New Roman" w:hAnsi="Times New Roman" w:eastAsia="DejaVu Sans" w:cs="DejaVu Sans"/>
+          <w:rFonts w:eastAsia="DejaVu Sans" w:cs="DejaVu Sans" w:ascii="Times New Roman" w:hAnsi="Times New Roman"/>
           <w:sz w:val="24"/>
           <w:szCs w:val="24"/>
           <w:lang w:val="en-US" w:eastAsia="en-US" w:bidi="en-US"/>
@@ -5157,7 +5168,7 @@
 </file>
 
 <file path=word/numbering.xml><?xml version="1.0" encoding="utf-8"?>
-<w:numbering xmlns:w="http://schemas.openxmlformats.org/wordprocessingml/2006/main" xmlns:o="urn:schemas-microsoft-com:office:office" xmlns:r="http://schemas.openxmlformats.org/officeDocument/2006/relationships" xmlns:v="urn:schemas-microsoft-com:vml">
+<w:numbering xmlns:w="http://schemas.openxmlformats.org/wordprocessingml/2006/main" xmlns:o="urn:schemas-microsoft-com:office:office" xmlns:r="http://schemas.openxmlformats.org/officeDocument/2006/relationships" xmlns:v="urn:schemas-microsoft-com:vml" xmlns:mc="http://schemas.openxmlformats.org/markup-compatibility/2006" xmlns:w14="http://schemas.microsoft.com/office/word/2010/wordml" mc:Ignorable="w14">
   <w:abstractNum w:abstractNumId="1">
     <w:lvl w:ilvl="0">
       <w:start w:val="1"/>
@@ -5165,11 +5176,13 @@
       <w:lvlText w:val=""/>
       <w:lvlJc w:val="left"/>
       <w:pPr>
+        <w:tabs>
+          <w:tab w:val="num" w:pos="0"/>
+        </w:tabs>
         <w:ind w:left="720" w:hanging="360"/>
       </w:pPr>
       <w:rPr>
         <w:rFonts w:ascii="Symbol" w:hAnsi="Symbol" w:cs="Symbol" w:hint="default"/>
-        <w:rFonts w:cs="Symbol"/>
       </w:rPr>
     </w:lvl>
     <w:lvl w:ilvl="1">
@@ -5178,11 +5191,13 @@
       <w:lvlText w:val="o"/>
       <w:lvlJc w:val="left"/>
       <w:pPr>
+        <w:tabs>
+          <w:tab w:val="num" w:pos="0"/>
+        </w:tabs>
         <w:ind w:left="1440" w:hanging="360"/>
       </w:pPr>
       <w:rPr>
         <w:rFonts w:ascii="Courier New" w:hAnsi="Courier New" w:cs="Courier New" w:hint="default"/>
-        <w:rFonts w:cs="Courier New"/>
       </w:rPr>
     </w:lvl>
     <w:lvl w:ilvl="2">
@@ -5191,11 +5206,13 @@
       <w:lvlText w:val=""/>
       <w:lvlJc w:val="left"/>
       <w:pPr>
+        <w:tabs>
+          <w:tab w:val="num" w:pos="0"/>
+        </w:tabs>
         <w:ind w:left="2160" w:hanging="360"/>
       </w:pPr>
       <w:rPr>
         <w:rFonts w:ascii="Wingdings" w:hAnsi="Wingdings" w:cs="Wingdings" w:hint="default"/>
-        <w:rFonts w:cs="Wingdings"/>
       </w:rPr>
     </w:lvl>
     <w:lvl w:ilvl="3">
@@ -5204,11 +5221,13 @@
       <w:lvlText w:val=""/>
       <w:lvlJc w:val="left"/>
       <w:pPr>
+        <w:tabs>
+          <w:tab w:val="num" w:pos="0"/>
+        </w:tabs>
         <w:ind w:left="2880" w:hanging="360"/>
       </w:pPr>
       <w:rPr>
         <w:rFonts w:ascii="Symbol" w:hAnsi="Symbol" w:cs="Symbol" w:hint="default"/>
-        <w:rFonts w:cs="Symbol"/>
       </w:rPr>
     </w:lvl>
     <w:lvl w:ilvl="4">
@@ -5217,11 +5236,13 @@
       <w:lvlText w:val="o"/>
       <w:lvlJc w:val="left"/>
       <w:pPr>
+        <w:tabs>
+          <w:tab w:val="num" w:pos="0"/>
+        </w:tabs>
         <w:ind w:left="3600" w:hanging="360"/>
       </w:pPr>
       <w:rPr>
         <w:rFonts w:ascii="Courier New" w:hAnsi="Courier New" w:cs="Courier New" w:hint="default"/>
-        <w:rFonts w:cs="Courier New"/>
       </w:rPr>
     </w:lvl>
     <w:lvl w:ilvl="5">
@@ -5230,11 +5251,13 @@
       <w:lvlText w:val=""/>
       <w:lvlJc w:val="left"/>
       <w:pPr>
+        <w:tabs>
+          <w:tab w:val="num" w:pos="0"/>
+        </w:tabs>
         <w:ind w:left="4320" w:hanging="360"/>
       </w:pPr>
       <w:rPr>
         <w:rFonts w:ascii="Wingdings" w:hAnsi="Wingdings" w:cs="Wingdings" w:hint="default"/>
-        <w:rFonts w:cs="Wingdings"/>
       </w:rPr>
     </w:lvl>
     <w:lvl w:ilvl="6">
@@ -5243,11 +5266,13 @@
       <w:lvlText w:val=""/>
       <w:lvlJc w:val="left"/>
       <w:pPr>
+        <w:tabs>
+          <w:tab w:val="num" w:pos="0"/>
+        </w:tabs>
         <w:ind w:left="5040" w:hanging="360"/>
       </w:pPr>
       <w:rPr>
         <w:rFonts w:ascii="Symbol" w:hAnsi="Symbol" w:cs="Symbol" w:hint="default"/>
-        <w:rFonts w:cs="Symbol"/>
       </w:rPr>
     </w:lvl>
     <w:lvl w:ilvl="7">
@@ -5256,11 +5281,13 @@
       <w:lvlText w:val="o"/>
       <w:lvlJc w:val="left"/>
       <w:pPr>
+        <w:tabs>
+          <w:tab w:val="num" w:pos="0"/>
+        </w:tabs>
         <w:ind w:left="5760" w:hanging="360"/>
       </w:pPr>
       <w:rPr>
         <w:rFonts w:ascii="Courier New" w:hAnsi="Courier New" w:cs="Courier New" w:hint="default"/>
-        <w:rFonts w:cs="Courier New"/>
       </w:rPr>
     </w:lvl>
     <w:lvl w:ilvl="8">
@@ -5269,11 +5296,13 @@
       <w:lvlText w:val=""/>
       <w:lvlJc w:val="left"/>
       <w:pPr>
+        <w:tabs>
+          <w:tab w:val="num" w:pos="0"/>
+        </w:tabs>
         <w:ind w:left="6480" w:hanging="360"/>
       </w:pPr>
       <w:rPr>
         <w:rFonts w:ascii="Wingdings" w:hAnsi="Wingdings" w:cs="Wingdings" w:hint="default"/>
-        <w:rFonts w:cs="Wingdings"/>
       </w:rPr>
     </w:lvl>
   </w:abstractNum>
@@ -5285,6 +5314,9 @@
       <w:lvlText w:val=""/>
       <w:lvlJc w:val="left"/>
       <w:pPr>
+        <w:tabs>
+          <w:tab w:val="num" w:pos="0"/>
+        </w:tabs>
         <w:ind w:left="0" w:hanging="0"/>
       </w:pPr>
     </w:lvl>
@@ -5295,6 +5327,9 @@
       <w:lvlText w:val=""/>
       <w:lvlJc w:val="left"/>
       <w:pPr>
+        <w:tabs>
+          <w:tab w:val="num" w:pos="0"/>
+        </w:tabs>
         <w:ind w:left="0" w:hanging="0"/>
       </w:pPr>
     </w:lvl>
@@ -5305,6 +5340,9 @@
       <w:lvlText w:val=""/>
       <w:lvlJc w:val="left"/>
       <w:pPr>
+        <w:tabs>
+          <w:tab w:val="num" w:pos="0"/>
+        </w:tabs>
         <w:ind w:left="0" w:hanging="0"/>
       </w:pPr>
     </w:lvl>
@@ -5315,6 +5353,9 @@
       <w:lvlText w:val=""/>
       <w:lvlJc w:val="left"/>
       <w:pPr>
+        <w:tabs>
+          <w:tab w:val="num" w:pos="0"/>
+        </w:tabs>
         <w:ind w:left="0" w:hanging="0"/>
       </w:pPr>
     </w:lvl>
@@ -5325,6 +5366,9 @@
       <w:lvlText w:val=""/>
       <w:lvlJc w:val="left"/>
       <w:pPr>
+        <w:tabs>
+          <w:tab w:val="num" w:pos="0"/>
+        </w:tabs>
         <w:ind w:left="0" w:hanging="0"/>
       </w:pPr>
     </w:lvl>
@@ -5335,6 +5379,9 @@
       <w:lvlText w:val=""/>
       <w:lvlJc w:val="left"/>
       <w:pPr>
+        <w:tabs>
+          <w:tab w:val="num" w:pos="0"/>
+        </w:tabs>
         <w:ind w:left="0" w:hanging="0"/>
       </w:pPr>
     </w:lvl>
@@ -5345,6 +5392,9 @@
       <w:lvlText w:val=""/>
       <w:lvlJc w:val="left"/>
       <w:pPr>
+        <w:tabs>
+          <w:tab w:val="num" w:pos="0"/>
+        </w:tabs>
         <w:ind w:left="0" w:hanging="0"/>
       </w:pPr>
     </w:lvl>
@@ -5355,6 +5405,9 @@
       <w:lvlText w:val=""/>
       <w:lvlJc w:val="left"/>
       <w:pPr>
+        <w:tabs>
+          <w:tab w:val="num" w:pos="0"/>
+        </w:tabs>
         <w:ind w:left="0" w:hanging="0"/>
       </w:pPr>
     </w:lvl>
@@ -5365,6 +5418,9 @@
       <w:lvlText w:val=""/>
       <w:lvlJc w:val="left"/>
       <w:pPr>
+        <w:tabs>
+          <w:tab w:val="num" w:pos="0"/>
+        </w:tabs>
         <w:ind w:left="0" w:hanging="0"/>
       </w:pPr>
     </w:lvl>
@@ -5389,7 +5445,9 @@
       </w:rPr>
     </w:rPrDefault>
     <w:pPrDefault>
-      <w:pPr/>
+      <w:pPr>
+        <w:suppressAutoHyphens w:val="true"/>
+      </w:pPr>
     </w:pPrDefault>
   </w:docDefaults>
   <w:latentStyles w:defLockedState="0" w:defUIPriority="99" w:defSemiHidden="0" w:defUnhideWhenUsed="0" w:defQFormat="0" w:count="371">
@@ -5775,7 +5833,7 @@
     </w:rPr>
   </w:style>
   <w:style w:type="paragraph" w:styleId="Heading1">
-    <w:name w:val="Heading 1"/>
+    <w:name w:val="heading 1"/>
     <w:basedOn w:val="Normal"/>
     <w:next w:val="Normal"/>
     <w:link w:val="Heading1Char"/>
@@ -5792,13 +5850,13 @@
       <w:rFonts w:ascii="Cambria" w:hAnsi="Cambria" w:eastAsia="ＭＳ ゴシック" w:cs="" w:asciiTheme="majorHAnsi" w:cstheme="majorBidi" w:eastAsiaTheme="majorEastAsia" w:hAnsiTheme="majorHAnsi"/>
       <w:b/>
       <w:bCs/>
-      <w:color w:val="365F91" w:themeColor="accent1" w:themeShade="bf"/>
+      <w:color w:themeColor="accent1" w:themeShade="bf" w:val="365F91"/>
       <w:sz w:val="28"/>
       <w:szCs w:val="28"/>
     </w:rPr>
   </w:style>
   <w:style w:type="paragraph" w:styleId="Heading2">
-    <w:name w:val="Heading 2"/>
+    <w:name w:val="heading 2"/>
     <w:basedOn w:val="Normal"/>
     <w:next w:val="Normal"/>
     <w:link w:val="Heading2Char"/>
@@ -5816,7 +5874,7 @@
       <w:rFonts w:ascii="Cambria" w:hAnsi="Cambria" w:eastAsia="ＭＳ ゴシック" w:cs="" w:asciiTheme="majorHAnsi" w:cstheme="majorBidi" w:eastAsiaTheme="majorEastAsia" w:hAnsiTheme="majorHAnsi"/>
       <w:b/>
       <w:bCs/>
-      <w:color w:val="4F81BD" w:themeColor="accent1"/>
+      <w:color w:themeColor="accent1" w:val="4F81BD"/>
       <w:sz w:val="26"/>
       <w:szCs w:val="26"/>
     </w:rPr>
@@ -5832,13 +5890,12 @@
   <w:style w:type="character" w:styleId="TitleChar" w:customStyle="1">
     <w:name w:val="Title Char"/>
     <w:basedOn w:val="DefaultParagraphFont"/>
-    <w:link w:val="Title"/>
     <w:uiPriority w:val="10"/>
     <w:qFormat/>
     <w:rsid w:val="006e16cd"/>
     <w:rPr>
       <w:rFonts w:ascii="Cambria" w:hAnsi="Cambria" w:eastAsia="ＭＳ ゴシック" w:cs="" w:asciiTheme="majorHAnsi" w:cstheme="majorBidi" w:eastAsiaTheme="majorEastAsia" w:hAnsiTheme="majorHAnsi"/>
-      <w:color w:val="17365D" w:themeColor="text2" w:themeShade="bf"/>
+      <w:color w:themeColor="text2" w:themeShade="bf" w:val="17365D"/>
       <w:spacing w:val="5"/>
       <w:kern w:val="2"/>
       <w:sz w:val="52"/>
@@ -5848,7 +5905,6 @@
   <w:style w:type="character" w:styleId="Heading1Char" w:customStyle="1">
     <w:name w:val="Heading 1 Char"/>
     <w:basedOn w:val="DefaultParagraphFont"/>
-    <w:link w:val="Heading1"/>
     <w:uiPriority w:val="9"/>
     <w:qFormat/>
     <w:rsid w:val="00b175b1"/>
@@ -5856,7 +5912,7 @@
       <w:rFonts w:ascii="Cambria" w:hAnsi="Cambria" w:eastAsia="ＭＳ ゴシック" w:cs="" w:asciiTheme="majorHAnsi" w:cstheme="majorBidi" w:eastAsiaTheme="majorEastAsia" w:hAnsiTheme="majorHAnsi"/>
       <w:b/>
       <w:bCs/>
-      <w:color w:val="365F91" w:themeColor="accent1" w:themeShade="bf"/>
+      <w:color w:themeColor="accent1" w:themeShade="bf" w:val="365F91"/>
       <w:sz w:val="28"/>
       <w:szCs w:val="28"/>
     </w:rPr>
@@ -5864,7 +5920,6 @@
   <w:style w:type="character" w:styleId="Heading2Char" w:customStyle="1">
     <w:name w:val="Heading 2 Char"/>
     <w:basedOn w:val="DefaultParagraphFont"/>
-    <w:link w:val="Heading2"/>
     <w:uiPriority w:val="9"/>
     <w:qFormat/>
     <w:rsid w:val="005c15e5"/>
@@ -5872,12 +5927,12 @@
       <w:rFonts w:ascii="Cambria" w:hAnsi="Cambria" w:eastAsia="ＭＳ ゴシック" w:cs="" w:asciiTheme="majorHAnsi" w:cstheme="majorBidi" w:eastAsiaTheme="majorEastAsia" w:hAnsiTheme="majorHAnsi"/>
       <w:b/>
       <w:bCs/>
-      <w:color w:val="4F81BD" w:themeColor="accent1"/>
+      <w:color w:themeColor="accent1" w:val="4F81BD"/>
       <w:sz w:val="26"/>
       <w:szCs w:val="26"/>
     </w:rPr>
   </w:style>
-  <w:style w:type="character" w:styleId="Annotationreference">
+  <w:style w:type="character" w:styleId="CommentReference">
     <w:name w:val="annotation reference"/>
     <w:basedOn w:val="DefaultParagraphFont"/>
     <w:uiPriority w:val="99"/>
@@ -5893,7 +5948,6 @@
   <w:style w:type="character" w:styleId="CommentTextChar" w:customStyle="1">
     <w:name w:val="Comment Text Char"/>
     <w:basedOn w:val="DefaultParagraphFont"/>
-    <w:link w:val="CommentText"/>
     <w:uiPriority w:val="99"/>
     <w:semiHidden/>
     <w:qFormat/>
@@ -5920,7 +5974,6 @@
   <w:style w:type="character" w:styleId="CommentSubjectChar" w:customStyle="1">
     <w:name w:val="Comment Subject Char"/>
     <w:basedOn w:val="CommentTextChar"/>
-    <w:link w:val="CommentSubject"/>
     <w:uiPriority w:val="99"/>
     <w:semiHidden/>
     <w:qFormat/>
@@ -5932,276 +5985,10 @@
       <w:szCs w:val="20"/>
     </w:rPr>
   </w:style>
-  <w:style w:type="character" w:styleId="ListLabel1">
-    <w:name w:val="ListLabel 1"/>
-    <w:qFormat/>
-    <w:rPr>
-      <w:rFonts w:cs="Courier New"/>
-    </w:rPr>
-  </w:style>
-  <w:style w:type="character" w:styleId="ListLabel2">
-    <w:name w:val="ListLabel 2"/>
-    <w:qFormat/>
-    <w:rPr>
-      <w:rFonts w:cs="Courier New"/>
-    </w:rPr>
-  </w:style>
-  <w:style w:type="character" w:styleId="ListLabel3">
-    <w:name w:val="ListLabel 3"/>
-    <w:qFormat/>
-    <w:rPr>
-      <w:rFonts w:cs="Courier New"/>
-    </w:rPr>
-  </w:style>
-  <w:style w:type="character" w:styleId="ListLabel4">
-    <w:name w:val="ListLabel 4"/>
-    <w:qFormat/>
-    <w:rPr>
-      <w:rFonts w:eastAsia="Calibri" w:cs="Helvetica"/>
-    </w:rPr>
-  </w:style>
-  <w:style w:type="character" w:styleId="ListLabel5">
-    <w:name w:val="ListLabel 5"/>
-    <w:qFormat/>
-    <w:rPr>
-      <w:rFonts w:cs="Courier New"/>
-    </w:rPr>
-  </w:style>
-  <w:style w:type="character" w:styleId="ListLabel6">
-    <w:name w:val="ListLabel 6"/>
-    <w:qFormat/>
-    <w:rPr>
-      <w:rFonts w:cs="Courier New"/>
-    </w:rPr>
-  </w:style>
-  <w:style w:type="character" w:styleId="ListLabel7">
-    <w:name w:val="ListLabel 7"/>
-    <w:qFormat/>
-    <w:rPr>
-      <w:rFonts w:cs="Courier New"/>
-    </w:rPr>
-  </w:style>
-  <w:style w:type="character" w:styleId="ListLabel8">
-    <w:name w:val="ListLabel 8"/>
-    <w:qFormat/>
-    <w:rPr>
-      <w:rFonts w:eastAsia="Calibri" w:cs=""/>
-    </w:rPr>
-  </w:style>
-  <w:style w:type="character" w:styleId="ListLabel9">
-    <w:name w:val="ListLabel 9"/>
-    <w:qFormat/>
-    <w:rPr>
-      <w:rFonts w:cs="Courier New"/>
-    </w:rPr>
-  </w:style>
-  <w:style w:type="character" w:styleId="ListLabel10">
-    <w:name w:val="ListLabel 10"/>
-    <w:qFormat/>
-    <w:rPr>
-      <w:rFonts w:cs="Courier New"/>
-    </w:rPr>
-  </w:style>
-  <w:style w:type="character" w:styleId="ListLabel11">
-    <w:name w:val="ListLabel 11"/>
-    <w:qFormat/>
-    <w:rPr>
-      <w:rFonts w:cs="Courier New"/>
-    </w:rPr>
-  </w:style>
-  <w:style w:type="character" w:styleId="ListLabel12">
-    <w:name w:val="ListLabel 12"/>
-    <w:qFormat/>
-    <w:rPr>
-      <w:rFonts w:cs="Symbol"/>
-    </w:rPr>
-  </w:style>
-  <w:style w:type="character" w:styleId="ListLabel13">
-    <w:name w:val="ListLabel 13"/>
-    <w:qFormat/>
-    <w:rPr>
-      <w:rFonts w:cs="Courier New"/>
-    </w:rPr>
-  </w:style>
-  <w:style w:type="character" w:styleId="ListLabel14">
-    <w:name w:val="ListLabel 14"/>
-    <w:qFormat/>
-    <w:rPr>
-      <w:rFonts w:cs="Wingdings"/>
-    </w:rPr>
-  </w:style>
-  <w:style w:type="character" w:styleId="ListLabel15">
-    <w:name w:val="ListLabel 15"/>
-    <w:qFormat/>
-    <w:rPr>
-      <w:rFonts w:cs="Symbol"/>
-    </w:rPr>
-  </w:style>
-  <w:style w:type="character" w:styleId="ListLabel16">
-    <w:name w:val="ListLabel 16"/>
-    <w:qFormat/>
-    <w:rPr>
-      <w:rFonts w:cs="Courier New"/>
-    </w:rPr>
-  </w:style>
-  <w:style w:type="character" w:styleId="ListLabel17">
-    <w:name w:val="ListLabel 17"/>
-    <w:qFormat/>
-    <w:rPr>
-      <w:rFonts w:cs="Wingdings"/>
-    </w:rPr>
-  </w:style>
-  <w:style w:type="character" w:styleId="ListLabel18">
-    <w:name w:val="ListLabel 18"/>
-    <w:qFormat/>
-    <w:rPr>
-      <w:rFonts w:cs="Symbol"/>
-    </w:rPr>
-  </w:style>
-  <w:style w:type="character" w:styleId="ListLabel19">
-    <w:name w:val="ListLabel 19"/>
-    <w:qFormat/>
-    <w:rPr>
-      <w:rFonts w:cs="Courier New"/>
-    </w:rPr>
-  </w:style>
-  <w:style w:type="character" w:styleId="ListLabel20">
-    <w:name w:val="ListLabel 20"/>
-    <w:qFormat/>
-    <w:rPr>
-      <w:rFonts w:cs="Wingdings"/>
-    </w:rPr>
-  </w:style>
-  <w:style w:type="character" w:styleId="ListLabel21">
-    <w:name w:val="ListLabel 21"/>
-    <w:qFormat/>
-    <w:rPr>
-      <w:rFonts w:cs="Symbol"/>
-    </w:rPr>
-  </w:style>
-  <w:style w:type="character" w:styleId="ListLabel22">
-    <w:name w:val="ListLabel 22"/>
-    <w:qFormat/>
-    <w:rPr>
-      <w:rFonts w:cs="Courier New"/>
-    </w:rPr>
-  </w:style>
-  <w:style w:type="character" w:styleId="ListLabel23">
-    <w:name w:val="ListLabel 23"/>
-    <w:qFormat/>
-    <w:rPr>
-      <w:rFonts w:cs="Wingdings"/>
-    </w:rPr>
-  </w:style>
-  <w:style w:type="character" w:styleId="ListLabel24">
-    <w:name w:val="ListLabel 24"/>
-    <w:qFormat/>
-    <w:rPr>
-      <w:rFonts w:cs="Symbol"/>
-    </w:rPr>
-  </w:style>
-  <w:style w:type="character" w:styleId="ListLabel25">
-    <w:name w:val="ListLabel 25"/>
-    <w:qFormat/>
-    <w:rPr>
-      <w:rFonts w:cs="Courier New"/>
-    </w:rPr>
-  </w:style>
-  <w:style w:type="character" w:styleId="ListLabel26">
-    <w:name w:val="ListLabel 26"/>
-    <w:qFormat/>
-    <w:rPr>
-      <w:rFonts w:cs="Wingdings"/>
-    </w:rPr>
-  </w:style>
-  <w:style w:type="character" w:styleId="ListLabel27">
-    <w:name w:val="ListLabel 27"/>
-    <w:qFormat/>
-    <w:rPr>
-      <w:rFonts w:cs="Symbol"/>
-    </w:rPr>
-  </w:style>
-  <w:style w:type="character" w:styleId="ListLabel28">
-    <w:name w:val="ListLabel 28"/>
-    <w:qFormat/>
-    <w:rPr>
-      <w:rFonts w:cs="Courier New"/>
-    </w:rPr>
-  </w:style>
-  <w:style w:type="character" w:styleId="ListLabel29">
-    <w:name w:val="ListLabel 29"/>
-    <w:qFormat/>
-    <w:rPr>
-      <w:rFonts w:cs="Wingdings"/>
-    </w:rPr>
-  </w:style>
-  <w:style w:type="character" w:styleId="ListLabel30">
-    <w:name w:val="ListLabel 30"/>
-    <w:qFormat/>
-    <w:rPr>
-      <w:rFonts w:cs="Symbol"/>
-    </w:rPr>
-  </w:style>
-  <w:style w:type="character" w:styleId="ListLabel31">
-    <w:name w:val="ListLabel 31"/>
-    <w:qFormat/>
-    <w:rPr>
-      <w:rFonts w:cs="Courier New"/>
-    </w:rPr>
-  </w:style>
-  <w:style w:type="character" w:styleId="ListLabel32">
-    <w:name w:val="ListLabel 32"/>
-    <w:qFormat/>
-    <w:rPr>
-      <w:rFonts w:cs="Wingdings"/>
-    </w:rPr>
-  </w:style>
-  <w:style w:type="character" w:styleId="ListLabel33">
-    <w:name w:val="ListLabel 33"/>
-    <w:qFormat/>
-    <w:rPr>
-      <w:rFonts w:cs="Symbol"/>
-    </w:rPr>
-  </w:style>
-  <w:style w:type="character" w:styleId="ListLabel34">
-    <w:name w:val="ListLabel 34"/>
-    <w:qFormat/>
-    <w:rPr>
-      <w:rFonts w:cs="Courier New"/>
-    </w:rPr>
-  </w:style>
-  <w:style w:type="character" w:styleId="ListLabel35">
-    <w:name w:val="ListLabel 35"/>
-    <w:qFormat/>
-    <w:rPr>
-      <w:rFonts w:cs="Wingdings"/>
-    </w:rPr>
-  </w:style>
-  <w:style w:type="character" w:styleId="ListLabel36">
-    <w:name w:val="ListLabel 36"/>
-    <w:qFormat/>
-    <w:rPr>
-      <w:rFonts w:cs="Symbol"/>
-    </w:rPr>
-  </w:style>
-  <w:style w:type="character" w:styleId="ListLabel37">
-    <w:name w:val="ListLabel 37"/>
-    <w:qFormat/>
-    <w:rPr>
-      <w:rFonts w:cs="Courier New"/>
-    </w:rPr>
-  </w:style>
-  <w:style w:type="character" w:styleId="ListLabel38">
-    <w:name w:val="ListLabel 38"/>
-    <w:qFormat/>
-    <w:rPr>
-      <w:rFonts w:cs="Wingdings"/>
-    </w:rPr>
-  </w:style>
-  <w:style w:type="paragraph" w:styleId="Heading">
-    <w:name w:val="Heading"/>
+  <w:style w:type="paragraph" w:styleId="berschrift">
+    <w:name w:val="Überschrift"/>
     <w:basedOn w:val="Normal"/>
-    <w:next w:val="TextBody"/>
+    <w:next w:val="BodyText"/>
     <w:qFormat/>
     <w:pPr>
       <w:keepNext w:val="true"/>
@@ -6213,7 +6000,7 @@
       <w:szCs w:val="28"/>
     </w:rPr>
   </w:style>
-  <w:style w:type="paragraph" w:styleId="TextBody">
+  <w:style w:type="paragraph" w:styleId="BodyText">
     <w:name w:val="Body Text"/>
     <w:basedOn w:val="Normal"/>
     <w:pPr>
@@ -6223,14 +6010,14 @@
   </w:style>
   <w:style w:type="paragraph" w:styleId="List">
     <w:name w:val="List"/>
-    <w:basedOn w:val="TextBody"/>
+    <w:basedOn w:val="BodyText"/>
     <w:pPr/>
     <w:rPr>
       <w:rFonts w:cs="FreeSans"/>
     </w:rPr>
   </w:style>
   <w:style w:type="paragraph" w:styleId="Caption">
-    <w:name w:val="Caption"/>
+    <w:name w:val="caption"/>
     <w:basedOn w:val="Normal"/>
     <w:qFormat/>
     <w:pPr>
@@ -6245,8 +6032,8 @@
       <w:szCs w:val="24"/>
     </w:rPr>
   </w:style>
-  <w:style w:type="paragraph" w:styleId="Index">
-    <w:name w:val="Index"/>
+  <w:style w:type="paragraph" w:styleId="Verzeichnis">
+    <w:name w:val="Verzeichnis"/>
     <w:basedOn w:val="Normal"/>
     <w:qFormat/>
     <w:pPr>
@@ -6273,7 +6060,7 @@
     </w:pPr>
     <w:rPr>
       <w:rFonts w:ascii="Cambria" w:hAnsi="Cambria" w:eastAsia="ＭＳ ゴシック" w:cs="" w:asciiTheme="majorHAnsi" w:cstheme="majorBidi" w:eastAsiaTheme="majorEastAsia" w:hAnsiTheme="majorHAnsi"/>
-      <w:color w:val="17365D" w:themeColor="text2" w:themeShade="bf"/>
+      <w:color w:themeColor="text2" w:themeShade="bf" w:val="17365D"/>
       <w:spacing w:val="5"/>
       <w:kern w:val="2"/>
       <w:sz w:val="52"/>
@@ -6308,12 +6095,12 @@
     <w:rsid w:val="00c7592e"/>
     <w:pPr>
       <w:spacing w:before="0" w:after="200"/>
-      <w:ind w:left="720" w:hanging="0"/>
+      <w:ind w:hanging="0" w:left="720"/>
       <w:contextualSpacing/>
     </w:pPr>
     <w:rPr/>
   </w:style>
-  <w:style w:type="paragraph" w:styleId="Annotationtext">
+  <w:style w:type="paragraph" w:styleId="CommentText">
     <w:name w:val="annotation text"/>
     <w:basedOn w:val="Normal"/>
     <w:link w:val="CommentTextChar"/>
@@ -6348,10 +6135,10 @@
       <w:szCs w:val="18"/>
     </w:rPr>
   </w:style>
-  <w:style w:type="paragraph" w:styleId="Annotationsubject">
+  <w:style w:type="paragraph" w:styleId="annotationsubject">
     <w:name w:val="annotation subject"/>
-    <w:basedOn w:val="Annotationtext"/>
-    <w:next w:val="Annotationtext"/>
+    <w:basedOn w:val="CommentText"/>
+    <w:next w:val="CommentText"/>
     <w:link w:val="CommentSubjectChar"/>
     <w:uiPriority w:val="99"/>
     <w:semiHidden/>
@@ -6364,8 +6151,8 @@
       <w:bCs/>
     </w:rPr>
   </w:style>
-  <w:style w:type="numbering" w:styleId="NoList" w:default="1">
-    <w:name w:val="No List"/>
+  <w:style w:type="numbering" w:styleId="KeineListe" w:default="1">
+    <w:name w:val="Keine Liste"/>
     <w:uiPriority w:val="99"/>
     <w:semiHidden/>
     <w:unhideWhenUsed/>
@@ -6377,7 +6164,6 @@
     <w:semiHidden/>
     <w:unhideWhenUsed/>
     <w:tblPr>
-      <w:tblInd w:w="0" w:type="dxa"/>
       <w:tblCellMar>
         <w:top w:w="0" w:type="dxa"/>
         <w:left w:w="108" w:type="dxa"/>
@@ -6430,7 +6216,7 @@
       <w:rPr>
         <w:b/>
         <w:bCs/>
-        <w:color w:val="FFFFFF" w:themeColor="background1"/>
+        <w:color w:themeColor="background1"/>
       </w:rPr>
       <w:tblPr/>
       <w:tcPr>
@@ -6620,41 +6406,41 @@
 </file>
 
 <file path=word/theme/theme1.xml><?xml version="1.0" encoding="utf-8"?>
-<a:theme xmlns:a="http://schemas.openxmlformats.org/drawingml/2006/main" name="Larissa">
+<a:theme xmlns:a="http://schemas.openxmlformats.org/drawingml/2006/main" xmlns:r="http://schemas.openxmlformats.org/officeDocument/2006/relationships" name="Larissa">
   <a:themeElements>
     <a:clrScheme name="Larissa">
       <a:dk1>
-        <a:sysClr val="windowText" lastClr="000000"/>
+        <a:srgbClr val="000000"/>
       </a:dk1>
       <a:lt1>
-        <a:sysClr val="window" lastClr="FFFFFF"/>
+        <a:srgbClr val="ffffff"/>
       </a:lt1>
       <a:dk2>
-        <a:srgbClr val="1F497D"/>
+        <a:srgbClr val="1f497d"/>
       </a:dk2>
       <a:lt2>
-        <a:srgbClr val="EEECE1"/>
+        <a:srgbClr val="eeece1"/>
       </a:lt2>
       <a:accent1>
-        <a:srgbClr val="4F81BD"/>
+        <a:srgbClr val="4f81bd"/>
       </a:accent1>
       <a:accent2>
-        <a:srgbClr val="C0504D"/>
+        <a:srgbClr val="c0504d"/>
       </a:accent2>
       <a:accent3>
-        <a:srgbClr val="9BBB59"/>
+        <a:srgbClr val="9bbb59"/>
       </a:accent3>
       <a:accent4>
-        <a:srgbClr val="8064A2"/>
+        <a:srgbClr val="8064a2"/>
       </a:accent4>
       <a:accent5>
-        <a:srgbClr val="4BACC6"/>
+        <a:srgbClr val="4bacc6"/>
       </a:accent5>
       <a:accent6>
-        <a:srgbClr val="F79646"/>
+        <a:srgbClr val="f79646"/>
       </a:accent6>
       <a:hlink>
-        <a:srgbClr val="0000FF"/>
+        <a:srgbClr val="0000ff"/>
       </a:hlink>
       <a:folHlink>
         <a:srgbClr val="800080"/>
@@ -6662,245 +6448,135 @@
     </a:clrScheme>
     <a:fontScheme name="Larissa">
       <a:majorFont>
-        <a:latin typeface="Cambria"/>
+        <a:latin typeface="Cambria" pitchFamily="0" charset="1"/>
         <a:ea typeface=""/>
         <a:cs typeface=""/>
-        <a:font script="Jpan" typeface="ＭＳ ゴシック"/>
-        <a:font script="Hang" typeface="맑은 고딕"/>
-        <a:font script="Hans" typeface="宋体"/>
-        <a:font script="Hant" typeface="新細明體"/>
-        <a:font script="Arab" typeface="Times New Roman"/>
-        <a:font script="Hebr" typeface="Times New Roman"/>
-        <a:font script="Thai" typeface="Angsana New"/>
-        <a:font script="Ethi" typeface="Nyala"/>
-        <a:font script="Beng" typeface="Vrinda"/>
-        <a:font script="Gujr" typeface="Shruti"/>
-        <a:font script="Khmr" typeface="MoolBoran"/>
-        <a:font script="Knda" typeface="Tunga"/>
-        <a:font script="Guru" typeface="Raavi"/>
-        <a:font script="Cans" typeface="Euphemia"/>
-        <a:font script="Cher" typeface="Plantagenet Cherokee"/>
-        <a:font script="Yiii" typeface="Microsoft Yi Baiti"/>
-        <a:font script="Tibt" typeface="Microsoft Himalaya"/>
-        <a:font script="Thaa" typeface="MV Boli"/>
-        <a:font script="Deva" typeface="Mangal"/>
-        <a:font script="Telu" typeface="Gautami"/>
-        <a:font script="Taml" typeface="Latha"/>
-        <a:font script="Syrc" typeface="Estrangelo Edessa"/>
-        <a:font script="Orya" typeface="Kalinga"/>
-        <a:font script="Mlym" typeface="Kartika"/>
-        <a:font script="Laoo" typeface="DokChampa"/>
-        <a:font script="Sinh" typeface="Iskoola Pota"/>
-        <a:font script="Mong" typeface="Mongolian Baiti"/>
-        <a:font script="Viet" typeface="Times New Roman"/>
-        <a:font script="Uigh" typeface="Microsoft Uighur"/>
-        <a:font script="Geor" typeface="Sylfaen"/>
       </a:majorFont>
       <a:minorFont>
-        <a:latin typeface="Calibri"/>
+        <a:latin typeface="Calibri" pitchFamily="0" charset="1"/>
         <a:ea typeface=""/>
         <a:cs typeface=""/>
-        <a:font script="Jpan" typeface="ＭＳ 明朝"/>
-        <a:font script="Hang" typeface="맑은 고딕"/>
-        <a:font script="Hans" typeface="宋体"/>
-        <a:font script="Hant" typeface="新細明體"/>
-        <a:font script="Arab" typeface="Arial"/>
-        <a:font script="Hebr" typeface="Arial"/>
-        <a:font script="Thai" typeface="Cordia New"/>
-        <a:font script="Ethi" typeface="Nyala"/>
-        <a:font script="Beng" typeface="Vrinda"/>
-        <a:font script="Gujr" typeface="Shruti"/>
-        <a:font script="Khmr" typeface="DaunPenh"/>
-        <a:font script="Knda" typeface="Tunga"/>
-        <a:font script="Guru" typeface="Raavi"/>
-        <a:font script="Cans" typeface="Euphemia"/>
-        <a:font script="Cher" typeface="Plantagenet Cherokee"/>
-        <a:font script="Yiii" typeface="Microsoft Yi Baiti"/>
-        <a:font script="Tibt" typeface="Microsoft Himalaya"/>
-        <a:font script="Thaa" typeface="MV Boli"/>
-        <a:font script="Deva" typeface="Mangal"/>
-        <a:font script="Telu" typeface="Gautami"/>
-        <a:font script="Taml" typeface="Latha"/>
-        <a:font script="Syrc" typeface="Estrangelo Edessa"/>
-        <a:font script="Orya" typeface="Kalinga"/>
-        <a:font script="Mlym" typeface="Kartika"/>
-        <a:font script="Laoo" typeface="DokChampa"/>
-        <a:font script="Sinh" typeface="Iskoola Pota"/>
-        <a:font script="Mong" typeface="Mongolian Baiti"/>
-        <a:font script="Viet" typeface="Arial"/>
-        <a:font script="Uigh" typeface="Microsoft Uighur"/>
-        <a:font script="Geor" typeface="Sylfaen"/>
       </a:minorFont>
     </a:fontScheme>
-    <a:fmtScheme name="Larissa">
+    <a:fmtScheme>
       <a:fillStyleLst>
         <a:solidFill>
           <a:schemeClr val="phClr"/>
         </a:solidFill>
-        <a:gradFill rotWithShape="1">
+        <a:gradFill>
           <a:gsLst>
             <a:gs pos="0">
               <a:schemeClr val="phClr">
                 <a:tint val="50000"/>
-                <a:satMod val="300000"/>
               </a:schemeClr>
             </a:gs>
             <a:gs pos="35000">
               <a:schemeClr val="phClr">
                 <a:tint val="37000"/>
-                <a:satMod val="300000"/>
               </a:schemeClr>
             </a:gs>
             <a:gs pos="100000">
               <a:schemeClr val="phClr">
                 <a:tint val="15000"/>
-                <a:satMod val="350000"/>
               </a:schemeClr>
             </a:gs>
           </a:gsLst>
           <a:lin ang="16200000" scaled="1"/>
+          <a:tileRect l="0" t="0" r="0" b="0"/>
         </a:gradFill>
-        <a:gradFill rotWithShape="1">
+        <a:gradFill>
           <a:gsLst>
             <a:gs pos="0">
               <a:schemeClr val="phClr">
                 <a:shade val="51000"/>
-                <a:satMod val="130000"/>
               </a:schemeClr>
             </a:gs>
             <a:gs pos="80000">
               <a:schemeClr val="phClr">
                 <a:shade val="93000"/>
-                <a:satMod val="130000"/>
               </a:schemeClr>
             </a:gs>
             <a:gs pos="100000">
               <a:schemeClr val="phClr">
                 <a:shade val="94000"/>
-                <a:satMod val="135000"/>
               </a:schemeClr>
             </a:gs>
           </a:gsLst>
           <a:lin ang="16200000" scaled="0"/>
+          <a:tileRect l="0" t="0" r="0" b="0"/>
         </a:gradFill>
       </a:fillStyleLst>
       <a:lnStyleLst>
         <a:ln w="9525" cap="flat" cmpd="sng" algn="ctr">
-          <a:solidFill>
-            <a:schemeClr val="phClr">
-              <a:shade val="95000"/>
-              <a:satMod val="105000"/>
-            </a:schemeClr>
-          </a:solidFill>
           <a:prstDash val="solid"/>
         </a:ln>
         <a:ln w="25400" cap="flat" cmpd="sng" algn="ctr">
-          <a:solidFill>
-            <a:schemeClr val="phClr"/>
-          </a:solidFill>
           <a:prstDash val="solid"/>
         </a:ln>
         <a:ln w="38100" cap="flat" cmpd="sng" algn="ctr">
-          <a:solidFill>
-            <a:schemeClr val="phClr"/>
-          </a:solidFill>
           <a:prstDash val="solid"/>
         </a:ln>
       </a:lnStyleLst>
       <a:effectStyleLst>
         <a:effectStyle>
-          <a:effectLst>
-            <a:outerShdw blurRad="40000" dist="20000" dir="5400000" rotWithShape="0">
-              <a:srgbClr val="000000">
-                <a:alpha val="38000"/>
-              </a:srgbClr>
-            </a:outerShdw>
-          </a:effectLst>
+          <a:effectLst/>
         </a:effectStyle>
         <a:effectStyle>
-          <a:effectLst>
-            <a:outerShdw blurRad="40000" dist="23000" dir="5400000" rotWithShape="0">
-              <a:srgbClr val="000000">
-                <a:alpha val="35000"/>
-              </a:srgbClr>
-            </a:outerShdw>
-          </a:effectLst>
+          <a:effectLst/>
         </a:effectStyle>
         <a:effectStyle>
-          <a:effectLst>
-            <a:outerShdw blurRad="40000" dist="23000" dir="5400000" rotWithShape="0">
-              <a:srgbClr val="000000">
-                <a:alpha val="35000"/>
-              </a:srgbClr>
-            </a:outerShdw>
-          </a:effectLst>
-          <a:scene3d>
-            <a:camera prst="orthographicFront">
-              <a:rot lat="0" lon="0" rev="0"/>
-            </a:camera>
-            <a:lightRig rig="threePt" dir="t">
-              <a:rot lat="0" lon="0" rev="1200000"/>
-            </a:lightRig>
-          </a:scene3d>
-          <a:sp3d>
-            <a:bevelT w="63500" h="25400"/>
-          </a:sp3d>
+          <a:effectLst/>
         </a:effectStyle>
       </a:effectStyleLst>
       <a:bgFillStyleLst>
         <a:solidFill>
           <a:schemeClr val="phClr"/>
         </a:solidFill>
-        <a:gradFill rotWithShape="1">
+        <a:gradFill>
           <a:gsLst>
             <a:gs pos="0">
               <a:schemeClr val="phClr">
                 <a:tint val="40000"/>
-                <a:satMod val="350000"/>
               </a:schemeClr>
             </a:gs>
             <a:gs pos="40000">
               <a:schemeClr val="phClr">
                 <a:tint val="45000"/>
                 <a:shade val="99000"/>
-                <a:satMod val="350000"/>
               </a:schemeClr>
             </a:gs>
             <a:gs pos="100000">
               <a:schemeClr val="phClr">
                 <a:shade val="20000"/>
-                <a:satMod val="255000"/>
               </a:schemeClr>
             </a:gs>
           </a:gsLst>
           <a:path path="circle">
             <a:fillToRect l="50000" t="-80000" r="50000" b="180000"/>
           </a:path>
+          <a:tileRect l="0" t="0" r="0" b="0"/>
         </a:gradFill>
-        <a:gradFill rotWithShape="1">
+        <a:gradFill>
           <a:gsLst>
             <a:gs pos="0">
               <a:schemeClr val="phClr">
                 <a:tint val="80000"/>
-                <a:satMod val="300000"/>
               </a:schemeClr>
             </a:gs>
             <a:gs pos="100000">
               <a:schemeClr val="phClr">
                 <a:shade val="30000"/>
-                <a:satMod val="200000"/>
               </a:schemeClr>
             </a:gs>
           </a:gsLst>
           <a:path path="circle">
             <a:fillToRect l="50000" t="50000" r="50000" b="50000"/>
           </a:path>
+          <a:tileRect l="0" t="0" r="0" b="0"/>
         </a:gradFill>
       </a:bgFillStyleLst>
     </a:fmtScheme>
   </a:themeElements>
-  <a:objectDefaults/>
-  <a:extraClrSchemeLst/>
 </a:theme>
 </file>
 

</xml_diff>